<commit_message>
QA realizado e informe añadido
</commit_message>
<xml_diff>
--- a/docs/Informe_QA_FastExpress.docx
+++ b/docs/Informe_QA_FastExpress.docx
@@ -20,6 +20,39 @@
           <w:i/>
         </w:rPr>
         <w:t>Cotización de envíos y descuentos</w:t>
+      </w:r>
+    </w:p>
+    <w:p>
+      <w:pPr>
+        <w:jc w:val="center"/>
+      </w:pPr>
+      <w:r>
+        <w:rPr>
+          <w:sz w:val="18"/>
+        </w:rPr>
+        <w:t>Curso: Calidad de Software</w:t>
+      </w:r>
+    </w:p>
+    <w:p>
+      <w:pPr>
+        <w:jc w:val="center"/>
+      </w:pPr>
+      <w:r>
+        <w:rPr>
+          <w:sz w:val="18"/>
+        </w:rPr>
+        <w:t>Equipo: Adolfo Andres Cera Urueta, Juan Esteban Ordoñez Tobon, Samuel David Morales Rios</w:t>
+      </w:r>
+    </w:p>
+    <w:p>
+      <w:pPr>
+        <w:jc w:val="center"/>
+      </w:pPr>
+      <w:r>
+        <w:rPr>
+          <w:sz w:val="18"/>
+        </w:rPr>
+        <w:t>Repositorio: https://github.com/Geriberto123/FastExpress.git</w:t>
       </w:r>
     </w:p>
     <w:p/>

</xml_diff>

<commit_message>
docs: corrige informe QA y evidencia final
</commit_message>
<xml_diff>
--- a/docs/Informe_QA_FastExpress.docx
+++ b/docs/Informe_QA_FastExpress.docx
@@ -64,7 +64,7 @@
         <w:t xml:space="preserve">Resultado ejecutivo. </w:t>
       </w:r>
       <w:r>
-        <w:t>La funcionalidad de cotización quedó verificada con evidencia automatizada: 177 pruebas de backend, 3 pruebas unitarias de validadores y 11 pruebas de interfaz superaron la ejecución final. Se corrigieron rutas de recursos del frontend y se añadieron pruebas de caja negra, interfaz real y rendimiento local.</w:t>
+        <w:t>La funcionalidad de cotización quedó verificada con evidencia automatizada: 177 pruebas de backend, 3 pruebas unitarias de validadores y 11 pruebas de interfaz superaron la ejecución de la base 7b98b16 registrada en docs/evidencias. Estas cifras corresponden a esa ejecución; si la versión final añade pruebas, debe repetirse la ejecución y actualizar este informe.</w:t>
       </w:r>
     </w:p>
     <w:tbl>
@@ -216,7 +216,7 @@
               <w:rPr>
                 <w:sz w:val="18"/>
               </w:rPr>
-              <w:t>docs/evidencias/backend-test.txt</w:t>
+              <w:t>docs/evidencias/backend-jest.json</w:t>
             </w:r>
           </w:p>
         </w:tc>
@@ -748,7 +748,7 @@
               <w:rPr>
                 <w:sz w:val="18"/>
               </w:rPr>
-              <w:t>Corregido; no hay evidencia histórica del fallo.</w:t>
+              <w:t>Corregido; UI-09 verifica la carga sin 4xx/5xx.</w:t>
             </w:r>
           </w:p>
         </w:tc>
@@ -1938,6 +1938,280 @@
           </w:p>
         </w:tc>
       </w:tr>
+      <w:tr>
+        <w:tc>
+          <w:tcPr>
+            <w:tcW w:type="dxa" w:w="1440"/>
+            <w:vAlign w:val="center"/>
+            <w:tcBorders>
+              <w:top w:val="single" w:sz="4" w:color="D9D9D9"/>
+              <w:left w:val="single" w:sz="4" w:color="D9D9D9"/>
+              <w:bottom w:val="single" w:sz="4" w:color="D9D9D9"/>
+              <w:right w:val="single" w:sz="4" w:color="D9D9D9"/>
+              <w:insideH w:val="single" w:sz="4" w:color="D9D9D9"/>
+              <w:insideV w:val="single" w:sz="4" w:color="D9D9D9"/>
+            </w:tcBorders>
+          </w:tcPr>
+          <w:p>
+            <w:r>
+              <w:rPr>
+                <w:sz w:val="18"/>
+              </w:rPr>
+              <w:t>INVÁLIDO</w:t>
+            </w:r>
+          </w:p>
+        </w:tc>
+        <w:tc>
+          <w:tcPr>
+            <w:tcW w:type="dxa" w:w="1728"/>
+            <w:vAlign w:val="center"/>
+            <w:tcBorders>
+              <w:top w:val="single" w:sz="4" w:color="D9D9D9"/>
+              <w:left w:val="single" w:sz="4" w:color="D9D9D9"/>
+              <w:bottom w:val="single" w:sz="4" w:color="D9D9D9"/>
+              <w:right w:val="single" w:sz="4" w:color="D9D9D9"/>
+              <w:insideH w:val="single" w:sz="4" w:color="D9D9D9"/>
+              <w:insideV w:val="single" w:sz="4" w:color="D9D9D9"/>
+            </w:tcBorders>
+          </w:tcPr>
+          <w:p>
+            <w:r>
+              <w:rPr>
+                <w:sz w:val="18"/>
+              </w:rPr>
+              <w:t>ESTANDAR</w:t>
+            </w:r>
+          </w:p>
+        </w:tc>
+        <w:tc>
+          <w:tcPr>
+            <w:tcW w:type="dxa" w:w="1440"/>
+            <w:vAlign w:val="center"/>
+            <w:tcBorders>
+              <w:top w:val="single" w:sz="4" w:color="D9D9D9"/>
+              <w:left w:val="single" w:sz="4" w:color="D9D9D9"/>
+              <w:bottom w:val="single" w:sz="4" w:color="D9D9D9"/>
+              <w:right w:val="single" w:sz="4" w:color="D9D9D9"/>
+              <w:insideH w:val="single" w:sz="4" w:color="D9D9D9"/>
+              <w:insideV w:val="single" w:sz="4" w:color="D9D9D9"/>
+            </w:tcBorders>
+          </w:tcPr>
+          <w:p>
+            <w:r>
+              <w:rPr>
+                <w:sz w:val="18"/>
+              </w:rPr>
+              <w:t>—</w:t>
+            </w:r>
+          </w:p>
+        </w:tc>
+        <w:tc>
+          <w:tcPr>
+            <w:tcW w:type="dxa" w:w="1440"/>
+            <w:vAlign w:val="center"/>
+            <w:tcBorders>
+              <w:top w:val="single" w:sz="4" w:color="D9D9D9"/>
+              <w:left w:val="single" w:sz="4" w:color="D9D9D9"/>
+              <w:bottom w:val="single" w:sz="4" w:color="D9D9D9"/>
+              <w:right w:val="single" w:sz="4" w:color="D9D9D9"/>
+              <w:insideH w:val="single" w:sz="4" w:color="D9D9D9"/>
+              <w:insideV w:val="single" w:sz="4" w:color="D9D9D9"/>
+            </w:tcBorders>
+          </w:tcPr>
+          <w:p>
+            <w:r>
+              <w:rPr>
+                <w:sz w:val="18"/>
+              </w:rPr>
+              <w:t>—</w:t>
+            </w:r>
+          </w:p>
+        </w:tc>
+        <w:tc>
+          <w:tcPr>
+            <w:tcW w:type="dxa" w:w="1296"/>
+            <w:vAlign w:val="center"/>
+            <w:tcBorders>
+              <w:top w:val="single" w:sz="4" w:color="D9D9D9"/>
+              <w:left w:val="single" w:sz="4" w:color="D9D9D9"/>
+              <w:bottom w:val="single" w:sz="4" w:color="D9D9D9"/>
+              <w:right w:val="single" w:sz="4" w:color="D9D9D9"/>
+              <w:insideH w:val="single" w:sz="4" w:color="D9D9D9"/>
+              <w:insideV w:val="single" w:sz="4" w:color="D9D9D9"/>
+            </w:tcBorders>
+          </w:tcPr>
+          <w:p>
+            <w:r>
+              <w:rPr>
+                <w:sz w:val="18"/>
+              </w:rPr>
+              <w:t>HTTP 400 cliente</w:t>
+            </w:r>
+          </w:p>
+        </w:tc>
+        <w:tc>
+          <w:tcPr>
+            <w:tcW w:type="dxa" w:w="1152"/>
+            <w:vAlign w:val="center"/>
+            <w:tcBorders>
+              <w:top w:val="single" w:sz="4" w:color="D9D9D9"/>
+              <w:left w:val="single" w:sz="4" w:color="D9D9D9"/>
+              <w:bottom w:val="single" w:sz="4" w:color="D9D9D9"/>
+              <w:right w:val="single" w:sz="4" w:color="D9D9D9"/>
+              <w:insideH w:val="single" w:sz="4" w:color="D9D9D9"/>
+              <w:insideV w:val="single" w:sz="4" w:color="D9D9D9"/>
+            </w:tcBorders>
+          </w:tcPr>
+          <w:p>
+            <w:r>
+              <w:rPr>
+                <w:sz w:val="18"/>
+              </w:rPr>
+              <w:t>CP-208</w:t>
+            </w:r>
+          </w:p>
+        </w:tc>
+      </w:tr>
+      <w:tr>
+        <w:tc>
+          <w:tcPr>
+            <w:tcW w:type="dxa" w:w="1440"/>
+            <w:shd w:fill="EAF2F8"/>
+            <w:vAlign w:val="center"/>
+            <w:tcBorders>
+              <w:top w:val="single" w:sz="4" w:color="D9D9D9"/>
+              <w:left w:val="single" w:sz="4" w:color="D9D9D9"/>
+              <w:bottom w:val="single" w:sz="4" w:color="D9D9D9"/>
+              <w:right w:val="single" w:sz="4" w:color="D9D9D9"/>
+              <w:insideH w:val="single" w:sz="4" w:color="D9D9D9"/>
+              <w:insideV w:val="single" w:sz="4" w:color="D9D9D9"/>
+            </w:tcBorders>
+          </w:tcPr>
+          <w:p>
+            <w:r>
+              <w:rPr>
+                <w:sz w:val="18"/>
+              </w:rPr>
+              <w:t>NUEVO</w:t>
+            </w:r>
+          </w:p>
+        </w:tc>
+        <w:tc>
+          <w:tcPr>
+            <w:tcW w:type="dxa" w:w="1728"/>
+            <w:shd w:fill="EAF2F8"/>
+            <w:vAlign w:val="center"/>
+            <w:tcBorders>
+              <w:top w:val="single" w:sz="4" w:color="D9D9D9"/>
+              <w:left w:val="single" w:sz="4" w:color="D9D9D9"/>
+              <w:bottom w:val="single" w:sz="4" w:color="D9D9D9"/>
+              <w:right w:val="single" w:sz="4" w:color="D9D9D9"/>
+              <w:insideH w:val="single" w:sz="4" w:color="D9D9D9"/>
+              <w:insideV w:val="single" w:sz="4" w:color="D9D9D9"/>
+            </w:tcBorders>
+          </w:tcPr>
+          <w:p>
+            <w:r>
+              <w:rPr>
+                <w:sz w:val="18"/>
+              </w:rPr>
+              <w:t>INVÁLIDO</w:t>
+            </w:r>
+          </w:p>
+        </w:tc>
+        <w:tc>
+          <w:tcPr>
+            <w:tcW w:type="dxa" w:w="1440"/>
+            <w:shd w:fill="EAF2F8"/>
+            <w:vAlign w:val="center"/>
+            <w:tcBorders>
+              <w:top w:val="single" w:sz="4" w:color="D9D9D9"/>
+              <w:left w:val="single" w:sz="4" w:color="D9D9D9"/>
+              <w:bottom w:val="single" w:sz="4" w:color="D9D9D9"/>
+              <w:right w:val="single" w:sz="4" w:color="D9D9D9"/>
+              <w:insideH w:val="single" w:sz="4" w:color="D9D9D9"/>
+              <w:insideV w:val="single" w:sz="4" w:color="D9D9D9"/>
+            </w:tcBorders>
+          </w:tcPr>
+          <w:p>
+            <w:r>
+              <w:rPr>
+                <w:sz w:val="18"/>
+              </w:rPr>
+              <w:t>—</w:t>
+            </w:r>
+          </w:p>
+        </w:tc>
+        <w:tc>
+          <w:tcPr>
+            <w:tcW w:type="dxa" w:w="1440"/>
+            <w:shd w:fill="EAF2F8"/>
+            <w:vAlign w:val="center"/>
+            <w:tcBorders>
+              <w:top w:val="single" w:sz="4" w:color="D9D9D9"/>
+              <w:left w:val="single" w:sz="4" w:color="D9D9D9"/>
+              <w:bottom w:val="single" w:sz="4" w:color="D9D9D9"/>
+              <w:right w:val="single" w:sz="4" w:color="D9D9D9"/>
+              <w:insideH w:val="single" w:sz="4" w:color="D9D9D9"/>
+              <w:insideV w:val="single" w:sz="4" w:color="D9D9D9"/>
+            </w:tcBorders>
+          </w:tcPr>
+          <w:p>
+            <w:r>
+              <w:rPr>
+                <w:sz w:val="18"/>
+              </w:rPr>
+              <w:t>—</w:t>
+            </w:r>
+          </w:p>
+        </w:tc>
+        <w:tc>
+          <w:tcPr>
+            <w:tcW w:type="dxa" w:w="1296"/>
+            <w:shd w:fill="EAF2F8"/>
+            <w:vAlign w:val="center"/>
+            <w:tcBorders>
+              <w:top w:val="single" w:sz="4" w:color="D9D9D9"/>
+              <w:left w:val="single" w:sz="4" w:color="D9D9D9"/>
+              <w:bottom w:val="single" w:sz="4" w:color="D9D9D9"/>
+              <w:right w:val="single" w:sz="4" w:color="D9D9D9"/>
+              <w:insideH w:val="single" w:sz="4" w:color="D9D9D9"/>
+              <w:insideV w:val="single" w:sz="4" w:color="D9D9D9"/>
+            </w:tcBorders>
+          </w:tcPr>
+          <w:p>
+            <w:r>
+              <w:rPr>
+                <w:sz w:val="18"/>
+              </w:rPr>
+              <w:t>HTTP 400 envío</w:t>
+            </w:r>
+          </w:p>
+        </w:tc>
+        <w:tc>
+          <w:tcPr>
+            <w:tcW w:type="dxa" w:w="1152"/>
+            <w:shd w:fill="EAF2F8"/>
+            <w:vAlign w:val="center"/>
+            <w:tcBorders>
+              <w:top w:val="single" w:sz="4" w:color="D9D9D9"/>
+              <w:left w:val="single" w:sz="4" w:color="D9D9D9"/>
+              <w:bottom w:val="single" w:sz="4" w:color="D9D9D9"/>
+              <w:right w:val="single" w:sz="4" w:color="D9D9D9"/>
+              <w:insideH w:val="single" w:sz="4" w:color="D9D9D9"/>
+              <w:insideV w:val="single" w:sz="4" w:color="D9D9D9"/>
+            </w:tcBorders>
+          </w:tcPr>
+          <w:p>
+            <w:r>
+              <w:rPr>
+                <w:sz w:val="18"/>
+              </w:rPr>
+              <w:t>CP-209</w:t>
+            </w:r>
+          </w:p>
+        </w:tc>
+      </w:tr>
     </w:tbl>
     <w:p/>
     <w:p>
@@ -1953,7 +2227,677 @@
         <w:rPr>
           <w:color w:val="000000"/>
         </w:rPr>
-        <w:t>4 Límites y validación de entradas</w:t>
+        <w:t>4 Límites, clases de equivalencia y validación de entradas</w:t>
+      </w:r>
+    </w:p>
+    <w:tbl>
+      <w:tblPr>
+        <w:tblStyle w:val="TableGrid"/>
+        <w:tblW w:type="auto" w:w="0"/>
+        <w:jc w:val="center"/>
+        <w:tblLook w:firstColumn="1" w:firstRow="1" w:lastColumn="0" w:lastRow="0" w:noHBand="0" w:noVBand="1" w:val="04A0"/>
+      </w:tblPr>
+      <w:tblGrid>
+        <w:gridCol w:w="2484"/>
+        <w:gridCol w:w="2484"/>
+        <w:gridCol w:w="2484"/>
+        <w:gridCol w:w="2484"/>
+      </w:tblGrid>
+      <w:tr>
+        <w:tc>
+          <w:tcPr>
+            <w:tcW w:type="dxa" w:w="2376"/>
+            <w:shd w:fill="17365D"/>
+            <w:tcBorders>
+              <w:top w:val="single" w:sz="4" w:color="D9D9D9"/>
+              <w:left w:val="single" w:sz="4" w:color="D9D9D9"/>
+              <w:bottom w:val="single" w:sz="4" w:color="D9D9D9"/>
+              <w:right w:val="single" w:sz="4" w:color="D9D9D9"/>
+              <w:insideH w:val="single" w:sz="4" w:color="D9D9D9"/>
+              <w:insideV w:val="single" w:sz="4" w:color="D9D9D9"/>
+            </w:tcBorders>
+          </w:tcPr>
+          <w:p>
+            <w:r>
+              <w:rPr>
+                <w:b/>
+                <w:color w:val="FFFFFF"/>
+                <w:sz w:val="18"/>
+              </w:rPr>
+              <w:t>Clase EP</w:t>
+            </w:r>
+          </w:p>
+        </w:tc>
+        <w:tc>
+          <w:tcPr>
+            <w:tcW w:type="dxa" w:w="2304"/>
+            <w:shd w:fill="17365D"/>
+            <w:tcBorders>
+              <w:top w:val="single" w:sz="4" w:color="D9D9D9"/>
+              <w:left w:val="single" w:sz="4" w:color="D9D9D9"/>
+              <w:bottom w:val="single" w:sz="4" w:color="D9D9D9"/>
+              <w:right w:val="single" w:sz="4" w:color="D9D9D9"/>
+              <w:insideH w:val="single" w:sz="4" w:color="D9D9D9"/>
+              <w:insideV w:val="single" w:sz="4" w:color="D9D9D9"/>
+            </w:tcBorders>
+          </w:tcPr>
+          <w:p>
+            <w:r>
+              <w:rPr>
+                <w:b/>
+                <w:color w:val="FFFFFF"/>
+                <w:sz w:val="18"/>
+              </w:rPr>
+              <w:t>Ejemplos</w:t>
+            </w:r>
+          </w:p>
+        </w:tc>
+        <w:tc>
+          <w:tcPr>
+            <w:tcW w:type="dxa" w:w="2880"/>
+            <w:shd w:fill="17365D"/>
+            <w:tcBorders>
+              <w:top w:val="single" w:sz="4" w:color="D9D9D9"/>
+              <w:left w:val="single" w:sz="4" w:color="D9D9D9"/>
+              <w:bottom w:val="single" w:sz="4" w:color="D9D9D9"/>
+              <w:right w:val="single" w:sz="4" w:color="D9D9D9"/>
+              <w:insideH w:val="single" w:sz="4" w:color="D9D9D9"/>
+              <w:insideV w:val="single" w:sz="4" w:color="D9D9D9"/>
+            </w:tcBorders>
+          </w:tcPr>
+          <w:p>
+            <w:r>
+              <w:rPr>
+                <w:b/>
+                <w:color w:val="FFFFFF"/>
+                <w:sz w:val="18"/>
+              </w:rPr>
+              <w:t>Resultado esperado</w:t>
+            </w:r>
+          </w:p>
+        </w:tc>
+        <w:tc>
+          <w:tcPr>
+            <w:tcW w:type="dxa" w:w="2016"/>
+            <w:shd w:fill="17365D"/>
+            <w:tcBorders>
+              <w:top w:val="single" w:sz="4" w:color="D9D9D9"/>
+              <w:left w:val="single" w:sz="4" w:color="D9D9D9"/>
+              <w:bottom w:val="single" w:sz="4" w:color="D9D9D9"/>
+              <w:right w:val="single" w:sz="4" w:color="D9D9D9"/>
+              <w:insideH w:val="single" w:sz="4" w:color="D9D9D9"/>
+              <w:insideV w:val="single" w:sz="4" w:color="D9D9D9"/>
+            </w:tcBorders>
+          </w:tcPr>
+          <w:p>
+            <w:r>
+              <w:rPr>
+                <w:b/>
+                <w:color w:val="FFFFFF"/>
+                <w:sz w:val="18"/>
+              </w:rPr>
+              <w:t>Prueba</w:t>
+            </w:r>
+          </w:p>
+        </w:tc>
+      </w:tr>
+      <w:tr>
+        <w:tc>
+          <w:tcPr>
+            <w:tcW w:type="dxa" w:w="2376"/>
+            <w:vAlign w:val="center"/>
+            <w:tcBorders>
+              <w:top w:val="single" w:sz="4" w:color="D9D9D9"/>
+              <w:left w:val="single" w:sz="4" w:color="D9D9D9"/>
+              <w:bottom w:val="single" w:sz="4" w:color="D9D9D9"/>
+              <w:right w:val="single" w:sz="4" w:color="D9D9D9"/>
+              <w:insideH w:val="single" w:sz="4" w:color="D9D9D9"/>
+              <w:insideV w:val="single" w:sz="4" w:color="D9D9D9"/>
+            </w:tcBorders>
+          </w:tcPr>
+          <w:p>
+            <w:r>
+              <w:rPr>
+                <w:sz w:val="18"/>
+              </w:rPr>
+              <w:t>Vacío</w:t>
+            </w:r>
+          </w:p>
+        </w:tc>
+        <w:tc>
+          <w:tcPr>
+            <w:tcW w:type="dxa" w:w="2304"/>
+            <w:vAlign w:val="center"/>
+            <w:tcBorders>
+              <w:top w:val="single" w:sz="4" w:color="D9D9D9"/>
+              <w:left w:val="single" w:sz="4" w:color="D9D9D9"/>
+              <w:bottom w:val="single" w:sz="4" w:color="D9D9D9"/>
+              <w:right w:val="single" w:sz="4" w:color="D9D9D9"/>
+              <w:insideH w:val="single" w:sz="4" w:color="D9D9D9"/>
+              <w:insideV w:val="single" w:sz="4" w:color="D9D9D9"/>
+            </w:tcBorders>
+          </w:tcPr>
+          <w:p>
+            <w:r>
+              <w:rPr>
+                <w:sz w:val="18"/>
+              </w:rPr>
+              <w:t>''</w:t>
+            </w:r>
+          </w:p>
+        </w:tc>
+        <w:tc>
+          <w:tcPr>
+            <w:tcW w:type="dxa" w:w="2880"/>
+            <w:vAlign w:val="center"/>
+            <w:tcBorders>
+              <w:top w:val="single" w:sz="4" w:color="D9D9D9"/>
+              <w:left w:val="single" w:sz="4" w:color="D9D9D9"/>
+              <w:bottom w:val="single" w:sz="4" w:color="D9D9D9"/>
+              <w:right w:val="single" w:sz="4" w:color="D9D9D9"/>
+              <w:insideH w:val="single" w:sz="4" w:color="D9D9D9"/>
+              <w:insideV w:val="single" w:sz="4" w:color="D9D9D9"/>
+            </w:tcBorders>
+          </w:tcPr>
+          <w:p>
+            <w:r>
+              <w:rPr>
+                <w:sz w:val="18"/>
+              </w:rPr>
+              <w:t>El peso es obligatorio</w:t>
+            </w:r>
+          </w:p>
+        </w:tc>
+        <w:tc>
+          <w:tcPr>
+            <w:tcW w:type="dxa" w:w="2016"/>
+            <w:vAlign w:val="center"/>
+            <w:tcBorders>
+              <w:top w:val="single" w:sz="4" w:color="D9D9D9"/>
+              <w:left w:val="single" w:sz="4" w:color="D9D9D9"/>
+              <w:bottom w:val="single" w:sz="4" w:color="D9D9D9"/>
+              <w:right w:val="single" w:sz="4" w:color="D9D9D9"/>
+              <w:insideH w:val="single" w:sz="4" w:color="D9D9D9"/>
+              <w:insideV w:val="single" w:sz="4" w:color="D9D9D9"/>
+            </w:tcBorders>
+          </w:tcPr>
+          <w:p>
+            <w:r>
+              <w:rPr>
+                <w:sz w:val="18"/>
+              </w:rPr>
+              <w:t>UI-02</w:t>
+            </w:r>
+          </w:p>
+        </w:tc>
+      </w:tr>
+      <w:tr>
+        <w:tc>
+          <w:tcPr>
+            <w:tcW w:type="dxa" w:w="2376"/>
+            <w:shd w:fill="EAF2F8"/>
+            <w:vAlign w:val="center"/>
+            <w:tcBorders>
+              <w:top w:val="single" w:sz="4" w:color="D9D9D9"/>
+              <w:left w:val="single" w:sz="4" w:color="D9D9D9"/>
+              <w:bottom w:val="single" w:sz="4" w:color="D9D9D9"/>
+              <w:right w:val="single" w:sz="4" w:color="D9D9D9"/>
+              <w:insideH w:val="single" w:sz="4" w:color="D9D9D9"/>
+              <w:insideV w:val="single" w:sz="4" w:color="D9D9D9"/>
+            </w:tcBorders>
+          </w:tcPr>
+          <w:p>
+            <w:r>
+              <w:rPr>
+                <w:sz w:val="18"/>
+              </w:rPr>
+              <w:t>No numérico o formato inválido</w:t>
+            </w:r>
+          </w:p>
+        </w:tc>
+        <w:tc>
+          <w:tcPr>
+            <w:tcW w:type="dxa" w:w="2304"/>
+            <w:shd w:fill="EAF2F8"/>
+            <w:vAlign w:val="center"/>
+            <w:tcBorders>
+              <w:top w:val="single" w:sz="4" w:color="D9D9D9"/>
+              <w:left w:val="single" w:sz="4" w:color="D9D9D9"/>
+              <w:bottom w:val="single" w:sz="4" w:color="D9D9D9"/>
+              <w:right w:val="single" w:sz="4" w:color="D9D9D9"/>
+              <w:insideH w:val="single" w:sz="4" w:color="D9D9D9"/>
+              <w:insideV w:val="single" w:sz="4" w:color="D9D9D9"/>
+            </w:tcBorders>
+          </w:tcPr>
+          <w:p>
+            <w:r>
+              <w:rPr>
+                <w:sz w:val="18"/>
+              </w:rPr>
+              <w:t>abc, 5kg, 1e3, 5,</w:t>
+            </w:r>
+          </w:p>
+        </w:tc>
+        <w:tc>
+          <w:tcPr>
+            <w:tcW w:type="dxa" w:w="2880"/>
+            <w:shd w:fill="EAF2F8"/>
+            <w:vAlign w:val="center"/>
+            <w:tcBorders>
+              <w:top w:val="single" w:sz="4" w:color="D9D9D9"/>
+              <w:left w:val="single" w:sz="4" w:color="D9D9D9"/>
+              <w:bottom w:val="single" w:sz="4" w:color="D9D9D9"/>
+              <w:right w:val="single" w:sz="4" w:color="D9D9D9"/>
+              <w:insideH w:val="single" w:sz="4" w:color="D9D9D9"/>
+              <w:insideV w:val="single" w:sz="4" w:color="D9D9D9"/>
+            </w:tcBorders>
+          </w:tcPr>
+          <w:p>
+            <w:r>
+              <w:rPr>
+                <w:sz w:val="18"/>
+              </w:rPr>
+              <w:t>Formato inválido</w:t>
+            </w:r>
+          </w:p>
+        </w:tc>
+        <w:tc>
+          <w:tcPr>
+            <w:tcW w:type="dxa" w:w="2016"/>
+            <w:shd w:fill="EAF2F8"/>
+            <w:vAlign w:val="center"/>
+            <w:tcBorders>
+              <w:top w:val="single" w:sz="4" w:color="D9D9D9"/>
+              <w:left w:val="single" w:sz="4" w:color="D9D9D9"/>
+              <w:bottom w:val="single" w:sz="4" w:color="D9D9D9"/>
+              <w:right w:val="single" w:sz="4" w:color="D9D9D9"/>
+              <w:insideH w:val="single" w:sz="4" w:color="D9D9D9"/>
+              <w:insideV w:val="single" w:sz="4" w:color="D9D9D9"/>
+            </w:tcBorders>
+          </w:tcPr>
+          <w:p>
+            <w:r>
+              <w:rPr>
+                <w:sz w:val="18"/>
+              </w:rPr>
+              <w:t>CP-002</w:t>
+            </w:r>
+          </w:p>
+        </w:tc>
+      </w:tr>
+      <w:tr>
+        <w:tc>
+          <w:tcPr>
+            <w:tcW w:type="dxa" w:w="2376"/>
+            <w:vAlign w:val="center"/>
+            <w:tcBorders>
+              <w:top w:val="single" w:sz="4" w:color="D9D9D9"/>
+              <w:left w:val="single" w:sz="4" w:color="D9D9D9"/>
+              <w:bottom w:val="single" w:sz="4" w:color="D9D9D9"/>
+              <w:right w:val="single" w:sz="4" w:color="D9D9D9"/>
+              <w:insideH w:val="single" w:sz="4" w:color="D9D9D9"/>
+              <w:insideV w:val="single" w:sz="4" w:color="D9D9D9"/>
+            </w:tcBorders>
+          </w:tcPr>
+          <w:p>
+            <w:r>
+              <w:rPr>
+                <w:sz w:val="18"/>
+              </w:rPr>
+              <w:t>Menor o igual a cero</w:t>
+            </w:r>
+          </w:p>
+        </w:tc>
+        <w:tc>
+          <w:tcPr>
+            <w:tcW w:type="dxa" w:w="2304"/>
+            <w:vAlign w:val="center"/>
+            <w:tcBorders>
+              <w:top w:val="single" w:sz="4" w:color="D9D9D9"/>
+              <w:left w:val="single" w:sz="4" w:color="D9D9D9"/>
+              <w:bottom w:val="single" w:sz="4" w:color="D9D9D9"/>
+              <w:right w:val="single" w:sz="4" w:color="D9D9D9"/>
+              <w:insideH w:val="single" w:sz="4" w:color="D9D9D9"/>
+              <w:insideV w:val="single" w:sz="4" w:color="D9D9D9"/>
+            </w:tcBorders>
+          </w:tcPr>
+          <w:p>
+            <w:r>
+              <w:rPr>
+                <w:sz w:val="18"/>
+              </w:rPr>
+              <w:t>0, 0.00</w:t>
+            </w:r>
+          </w:p>
+        </w:tc>
+        <w:tc>
+          <w:tcPr>
+            <w:tcW w:type="dxa" w:w="2880"/>
+            <w:vAlign w:val="center"/>
+            <w:tcBorders>
+              <w:top w:val="single" w:sz="4" w:color="D9D9D9"/>
+              <w:left w:val="single" w:sz="4" w:color="D9D9D9"/>
+              <w:bottom w:val="single" w:sz="4" w:color="D9D9D9"/>
+              <w:right w:val="single" w:sz="4" w:color="D9D9D9"/>
+              <w:insideH w:val="single" w:sz="4" w:color="D9D9D9"/>
+              <w:insideV w:val="single" w:sz="4" w:color="D9D9D9"/>
+            </w:tcBorders>
+          </w:tcPr>
+          <w:p>
+            <w:r>
+              <w:rPr>
+                <w:sz w:val="18"/>
+              </w:rPr>
+              <w:t>Peso mínimo 0.01 kg</w:t>
+            </w:r>
+          </w:p>
+        </w:tc>
+        <w:tc>
+          <w:tcPr>
+            <w:tcW w:type="dxa" w:w="2016"/>
+            <w:vAlign w:val="center"/>
+            <w:tcBorders>
+              <w:top w:val="single" w:sz="4" w:color="D9D9D9"/>
+              <w:left w:val="single" w:sz="4" w:color="D9D9D9"/>
+              <w:bottom w:val="single" w:sz="4" w:color="D9D9D9"/>
+              <w:right w:val="single" w:sz="4" w:color="D9D9D9"/>
+              <w:insideH w:val="single" w:sz="4" w:color="D9D9D9"/>
+              <w:insideV w:val="single" w:sz="4" w:color="D9D9D9"/>
+            </w:tcBorders>
+          </w:tcPr>
+          <w:p>
+            <w:r>
+              <w:rPr>
+                <w:sz w:val="18"/>
+              </w:rPr>
+              <w:t>CP-109</w:t>
+            </w:r>
+          </w:p>
+        </w:tc>
+      </w:tr>
+      <w:tr>
+        <w:tc>
+          <w:tcPr>
+            <w:tcW w:type="dxa" w:w="2376"/>
+            <w:shd w:fill="EAF2F8"/>
+            <w:vAlign w:val="center"/>
+            <w:tcBorders>
+              <w:top w:val="single" w:sz="4" w:color="D9D9D9"/>
+              <w:left w:val="single" w:sz="4" w:color="D9D9D9"/>
+              <w:bottom w:val="single" w:sz="4" w:color="D9D9D9"/>
+              <w:right w:val="single" w:sz="4" w:color="D9D9D9"/>
+              <w:insideH w:val="single" w:sz="4" w:color="D9D9D9"/>
+              <w:insideV w:val="single" w:sz="4" w:color="D9D9D9"/>
+            </w:tcBorders>
+          </w:tcPr>
+          <w:p>
+            <w:r>
+              <w:rPr>
+                <w:sz w:val="18"/>
+              </w:rPr>
+              <w:t>Tramo 1</w:t>
+            </w:r>
+          </w:p>
+        </w:tc>
+        <w:tc>
+          <w:tcPr>
+            <w:tcW w:type="dxa" w:w="2304"/>
+            <w:shd w:fill="EAF2F8"/>
+            <w:vAlign w:val="center"/>
+            <w:tcBorders>
+              <w:top w:val="single" w:sz="4" w:color="D9D9D9"/>
+              <w:left w:val="single" w:sz="4" w:color="D9D9D9"/>
+              <w:bottom w:val="single" w:sz="4" w:color="D9D9D9"/>
+              <w:right w:val="single" w:sz="4" w:color="D9D9D9"/>
+              <w:insideH w:val="single" w:sz="4" w:color="D9D9D9"/>
+              <w:insideV w:val="single" w:sz="4" w:color="D9D9D9"/>
+            </w:tcBorders>
+          </w:tcPr>
+          <w:p>
+            <w:r>
+              <w:rPr>
+                <w:sz w:val="18"/>
+              </w:rPr>
+              <w:t>0.01 a 5.00</w:t>
+            </w:r>
+          </w:p>
+        </w:tc>
+        <w:tc>
+          <w:tcPr>
+            <w:tcW w:type="dxa" w:w="2880"/>
+            <w:shd w:fill="EAF2F8"/>
+            <w:vAlign w:val="center"/>
+            <w:tcBorders>
+              <w:top w:val="single" w:sz="4" w:color="D9D9D9"/>
+              <w:left w:val="single" w:sz="4" w:color="D9D9D9"/>
+              <w:bottom w:val="single" w:sz="4" w:color="D9D9D9"/>
+              <w:right w:val="single" w:sz="4" w:color="D9D9D9"/>
+              <w:insideH w:val="single" w:sz="4" w:color="D9D9D9"/>
+              <w:insideV w:val="single" w:sz="4" w:color="D9D9D9"/>
+            </w:tcBorders>
+          </w:tcPr>
+          <w:p>
+            <w:r>
+              <w:rPr>
+                <w:sz w:val="18"/>
+              </w:rPr>
+              <w:t>Tarifa de 2 USD/kg</w:t>
+            </w:r>
+          </w:p>
+        </w:tc>
+        <w:tc>
+          <w:tcPr>
+            <w:tcW w:type="dxa" w:w="2016"/>
+            <w:shd w:fill="EAF2F8"/>
+            <w:vAlign w:val="center"/>
+            <w:tcBorders>
+              <w:top w:val="single" w:sz="4" w:color="D9D9D9"/>
+              <w:left w:val="single" w:sz="4" w:color="D9D9D9"/>
+              <w:bottom w:val="single" w:sz="4" w:color="D9D9D9"/>
+              <w:right w:val="single" w:sz="4" w:color="D9D9D9"/>
+              <w:insideH w:val="single" w:sz="4" w:color="D9D9D9"/>
+              <w:insideV w:val="single" w:sz="4" w:color="D9D9D9"/>
+            </w:tcBorders>
+          </w:tcPr>
+          <w:p>
+            <w:r>
+              <w:rPr>
+                <w:sz w:val="18"/>
+              </w:rPr>
+              <w:t>CP-101 a CP-104</w:t>
+            </w:r>
+          </w:p>
+        </w:tc>
+      </w:tr>
+      <w:tr>
+        <w:tc>
+          <w:tcPr>
+            <w:tcW w:type="dxa" w:w="2376"/>
+            <w:vAlign w:val="center"/>
+            <w:tcBorders>
+              <w:top w:val="single" w:sz="4" w:color="D9D9D9"/>
+              <w:left w:val="single" w:sz="4" w:color="D9D9D9"/>
+              <w:bottom w:val="single" w:sz="4" w:color="D9D9D9"/>
+              <w:right w:val="single" w:sz="4" w:color="D9D9D9"/>
+              <w:insideH w:val="single" w:sz="4" w:color="D9D9D9"/>
+              <w:insideV w:val="single" w:sz="4" w:color="D9D9D9"/>
+            </w:tcBorders>
+          </w:tcPr>
+          <w:p>
+            <w:r>
+              <w:rPr>
+                <w:sz w:val="18"/>
+              </w:rPr>
+              <w:t>Tramo 2</w:t>
+            </w:r>
+          </w:p>
+        </w:tc>
+        <w:tc>
+          <w:tcPr>
+            <w:tcW w:type="dxa" w:w="2304"/>
+            <w:vAlign w:val="center"/>
+            <w:tcBorders>
+              <w:top w:val="single" w:sz="4" w:color="D9D9D9"/>
+              <w:left w:val="single" w:sz="4" w:color="D9D9D9"/>
+              <w:bottom w:val="single" w:sz="4" w:color="D9D9D9"/>
+              <w:right w:val="single" w:sz="4" w:color="D9D9D9"/>
+              <w:insideH w:val="single" w:sz="4" w:color="D9D9D9"/>
+              <w:insideV w:val="single" w:sz="4" w:color="D9D9D9"/>
+            </w:tcBorders>
+          </w:tcPr>
+          <w:p>
+            <w:r>
+              <w:rPr>
+                <w:sz w:val="18"/>
+              </w:rPr>
+              <w:t>5.01 a 20.00</w:t>
+            </w:r>
+          </w:p>
+        </w:tc>
+        <w:tc>
+          <w:tcPr>
+            <w:tcW w:type="dxa" w:w="2880"/>
+            <w:vAlign w:val="center"/>
+            <w:tcBorders>
+              <w:top w:val="single" w:sz="4" w:color="D9D9D9"/>
+              <w:left w:val="single" w:sz="4" w:color="D9D9D9"/>
+              <w:bottom w:val="single" w:sz="4" w:color="D9D9D9"/>
+              <w:right w:val="single" w:sz="4" w:color="D9D9D9"/>
+              <w:insideH w:val="single" w:sz="4" w:color="D9D9D9"/>
+              <w:insideV w:val="single" w:sz="4" w:color="D9D9D9"/>
+            </w:tcBorders>
+          </w:tcPr>
+          <w:p>
+            <w:r>
+              <w:rPr>
+                <w:sz w:val="18"/>
+              </w:rPr>
+              <w:t>Tarifa de 4 USD/kg</w:t>
+            </w:r>
+          </w:p>
+        </w:tc>
+        <w:tc>
+          <w:tcPr>
+            <w:tcW w:type="dxa" w:w="2016"/>
+            <w:vAlign w:val="center"/>
+            <w:tcBorders>
+              <w:top w:val="single" w:sz="4" w:color="D9D9D9"/>
+              <w:left w:val="single" w:sz="4" w:color="D9D9D9"/>
+              <w:bottom w:val="single" w:sz="4" w:color="D9D9D9"/>
+              <w:right w:val="single" w:sz="4" w:color="D9D9D9"/>
+              <w:insideH w:val="single" w:sz="4" w:color="D9D9D9"/>
+              <w:insideV w:val="single" w:sz="4" w:color="D9D9D9"/>
+            </w:tcBorders>
+          </w:tcPr>
+          <w:p>
+            <w:r>
+              <w:rPr>
+                <w:sz w:val="18"/>
+              </w:rPr>
+              <w:t>CP-105 a CP-108</w:t>
+            </w:r>
+          </w:p>
+        </w:tc>
+      </w:tr>
+      <w:tr>
+        <w:tc>
+          <w:tcPr>
+            <w:tcW w:type="dxa" w:w="2376"/>
+            <w:shd w:fill="EAF2F8"/>
+            <w:vAlign w:val="center"/>
+            <w:tcBorders>
+              <w:top w:val="single" w:sz="4" w:color="D9D9D9"/>
+              <w:left w:val="single" w:sz="4" w:color="D9D9D9"/>
+              <w:bottom w:val="single" w:sz="4" w:color="D9D9D9"/>
+              <w:right w:val="single" w:sz="4" w:color="D9D9D9"/>
+              <w:insideH w:val="single" w:sz="4" w:color="D9D9D9"/>
+              <w:insideV w:val="single" w:sz="4" w:color="D9D9D9"/>
+            </w:tcBorders>
+          </w:tcPr>
+          <w:p>
+            <w:r>
+              <w:rPr>
+                <w:sz w:val="18"/>
+              </w:rPr>
+              <w:t>Superior al máximo</w:t>
+            </w:r>
+          </w:p>
+        </w:tc>
+        <w:tc>
+          <w:tcPr>
+            <w:tcW w:type="dxa" w:w="2304"/>
+            <w:shd w:fill="EAF2F8"/>
+            <w:vAlign w:val="center"/>
+            <w:tcBorders>
+              <w:top w:val="single" w:sz="4" w:color="D9D9D9"/>
+              <w:left w:val="single" w:sz="4" w:color="D9D9D9"/>
+              <w:bottom w:val="single" w:sz="4" w:color="D9D9D9"/>
+              <w:right w:val="single" w:sz="4" w:color="D9D9D9"/>
+              <w:insideH w:val="single" w:sz="4" w:color="D9D9D9"/>
+              <w:insideV w:val="single" w:sz="4" w:color="D9D9D9"/>
+            </w:tcBorders>
+          </w:tcPr>
+          <w:p>
+            <w:r>
+              <w:rPr>
+                <w:sz w:val="18"/>
+              </w:rPr>
+              <w:t>20.01</w:t>
+            </w:r>
+          </w:p>
+        </w:tc>
+        <w:tc>
+          <w:tcPr>
+            <w:tcW w:type="dxa" w:w="2880"/>
+            <w:shd w:fill="EAF2F8"/>
+            <w:vAlign w:val="center"/>
+            <w:tcBorders>
+              <w:top w:val="single" w:sz="4" w:color="D9D9D9"/>
+              <w:left w:val="single" w:sz="4" w:color="D9D9D9"/>
+              <w:bottom w:val="single" w:sz="4" w:color="D9D9D9"/>
+              <w:right w:val="single" w:sz="4" w:color="D9D9D9"/>
+              <w:insideH w:val="single" w:sz="4" w:color="D9D9D9"/>
+              <w:insideV w:val="single" w:sz="4" w:color="D9D9D9"/>
+            </w:tcBorders>
+          </w:tcPr>
+          <w:p>
+            <w:r>
+              <w:rPr>
+                <w:sz w:val="18"/>
+              </w:rPr>
+              <w:t>Límite excedido</w:t>
+            </w:r>
+          </w:p>
+        </w:tc>
+        <w:tc>
+          <w:tcPr>
+            <w:tcW w:type="dxa" w:w="2016"/>
+            <w:shd w:fill="EAF2F8"/>
+            <w:vAlign w:val="center"/>
+            <w:tcBorders>
+              <w:top w:val="single" w:sz="4" w:color="D9D9D9"/>
+              <w:left w:val="single" w:sz="4" w:color="D9D9D9"/>
+              <w:bottom w:val="single" w:sz="4" w:color="D9D9D9"/>
+              <w:right w:val="single" w:sz="4" w:color="D9D9D9"/>
+              <w:insideH w:val="single" w:sz="4" w:color="D9D9D9"/>
+              <w:insideV w:val="single" w:sz="4" w:color="D9D9D9"/>
+            </w:tcBorders>
+          </w:tcPr>
+          <w:p>
+            <w:r>
+              <w:rPr>
+                <w:sz w:val="18"/>
+              </w:rPr>
+              <w:t>CP-110</w:t>
+            </w:r>
+          </w:p>
+        </w:tc>
+      </w:tr>
+    </w:tbl>
+    <w:p/>
+    <w:p>
+      <w:r>
+        <w:t>BVA de peso con NUEVO y ESTANDAR:</w:t>
       </w:r>
     </w:p>
     <w:tbl>
@@ -2807,7 +3751,590 @@
     <w:p/>
     <w:p>
       <w:r>
-        <w:t>No existe un campo de entrada llamado monto. En este informe, monto es el total cotizado de salida; por ello sus límites se prueban mediante los límites del peso. Se aceptan 7.5, 7,5 y espacios externos; formatos de miles, notación exponencial o más de dos decimales se rechazan.</w:t>
+        <w:t>Clases de equivalencia del peso: vacío (UI-02), no numérico o formato inválido (CP-002), menor o igual a cero (CP-109 para 0 y 0.00), tramo 1 (CP-101 a CP-104), tramo 2 (CP-105 a CP-108) y superior al máximo (CP-110). El valor negativo -1 se rechaza por formato antes que por mínimo; aún no tiene un caso propio y se recomienda añadirlo.</w:t>
+      </w:r>
+    </w:p>
+    <w:p>
+      <w:r>
+        <w:t>No existe un campo de entrada llamado monto. En este informe, monto es el total cotizado de salida; sus límites se prueban mediante los límites del peso y se resumen en la siguiente tabla.</w:t>
+      </w:r>
+    </w:p>
+    <w:tbl>
+      <w:tblPr>
+        <w:tblStyle w:val="TableGrid"/>
+        <w:tblW w:type="auto" w:w="0"/>
+        <w:jc w:val="center"/>
+        <w:tblLook w:firstColumn="1" w:firstRow="1" w:lastColumn="0" w:lastRow="0" w:noHBand="0" w:noVBand="1" w:val="04A0"/>
+      </w:tblPr>
+      <w:tblGrid>
+        <w:gridCol w:w="3312"/>
+        <w:gridCol w:w="3312"/>
+        <w:gridCol w:w="3312"/>
+      </w:tblGrid>
+      <w:tr>
+        <w:tc>
+          <w:tcPr>
+            <w:tcW w:type="dxa" w:w="5184"/>
+            <w:shd w:fill="17365D"/>
+            <w:tcBorders>
+              <w:top w:val="single" w:sz="4" w:color="D9D9D9"/>
+              <w:left w:val="single" w:sz="4" w:color="D9D9D9"/>
+              <w:bottom w:val="single" w:sz="4" w:color="D9D9D9"/>
+              <w:right w:val="single" w:sz="4" w:color="D9D9D9"/>
+              <w:insideH w:val="single" w:sz="4" w:color="D9D9D9"/>
+              <w:insideV w:val="single" w:sz="4" w:color="D9D9D9"/>
+            </w:tcBorders>
+          </w:tcPr>
+          <w:p>
+            <w:r>
+              <w:rPr>
+                <w:b/>
+                <w:color w:val="FFFFFF"/>
+                <w:sz w:val="18"/>
+              </w:rPr>
+              <w:t>Entrada de la prueba</w:t>
+            </w:r>
+          </w:p>
+        </w:tc>
+        <w:tc>
+          <w:tcPr>
+            <w:tcW w:type="dxa" w:w="2304"/>
+            <w:shd w:fill="17365D"/>
+            <w:tcBorders>
+              <w:top w:val="single" w:sz="4" w:color="D9D9D9"/>
+              <w:left w:val="single" w:sz="4" w:color="D9D9D9"/>
+              <w:bottom w:val="single" w:sz="4" w:color="D9D9D9"/>
+              <w:right w:val="single" w:sz="4" w:color="D9D9D9"/>
+              <w:insideH w:val="single" w:sz="4" w:color="D9D9D9"/>
+              <w:insideV w:val="single" w:sz="4" w:color="D9D9D9"/>
+            </w:tcBorders>
+          </w:tcPr>
+          <w:p>
+            <w:r>
+              <w:rPr>
+                <w:b/>
+                <w:color w:val="FFFFFF"/>
+                <w:sz w:val="18"/>
+              </w:rPr>
+              <w:t>Total esperado</w:t>
+            </w:r>
+          </w:p>
+        </w:tc>
+        <w:tc>
+          <w:tcPr>
+            <w:tcW w:type="dxa" w:w="1440"/>
+            <w:shd w:fill="17365D"/>
+            <w:tcBorders>
+              <w:top w:val="single" w:sz="4" w:color="D9D9D9"/>
+              <w:left w:val="single" w:sz="4" w:color="D9D9D9"/>
+              <w:bottom w:val="single" w:sz="4" w:color="D9D9D9"/>
+              <w:right w:val="single" w:sz="4" w:color="D9D9D9"/>
+              <w:insideH w:val="single" w:sz="4" w:color="D9D9D9"/>
+              <w:insideV w:val="single" w:sz="4" w:color="D9D9D9"/>
+            </w:tcBorders>
+          </w:tcPr>
+          <w:p>
+            <w:r>
+              <w:rPr>
+                <w:b/>
+                <w:color w:val="FFFFFF"/>
+                <w:sz w:val="18"/>
+              </w:rPr>
+              <w:t>Caso</w:t>
+            </w:r>
+          </w:p>
+        </w:tc>
+      </w:tr>
+      <w:tr>
+        <w:tc>
+          <w:tcPr>
+            <w:tcW w:type="dxa" w:w="5184"/>
+            <w:vAlign w:val="center"/>
+            <w:tcBorders>
+              <w:top w:val="single" w:sz="4" w:color="D9D9D9"/>
+              <w:left w:val="single" w:sz="4" w:color="D9D9D9"/>
+              <w:bottom w:val="single" w:sz="4" w:color="D9D9D9"/>
+              <w:right w:val="single" w:sz="4" w:color="D9D9D9"/>
+              <w:insideH w:val="single" w:sz="4" w:color="D9D9D9"/>
+              <w:insideV w:val="single" w:sz="4" w:color="D9D9D9"/>
+            </w:tcBorders>
+          </w:tcPr>
+          <w:p>
+            <w:r>
+              <w:rPr>
+                <w:sz w:val="18"/>
+              </w:rPr>
+              <w:t>VIP, 0.01 kg, ESTANDAR (mínimo alcanzable)</w:t>
+            </w:r>
+          </w:p>
+        </w:tc>
+        <w:tc>
+          <w:tcPr>
+            <w:tcW w:type="dxa" w:w="2304"/>
+            <w:vAlign w:val="center"/>
+            <w:tcBorders>
+              <w:top w:val="single" w:sz="4" w:color="D9D9D9"/>
+              <w:left w:val="single" w:sz="4" w:color="D9D9D9"/>
+              <w:bottom w:val="single" w:sz="4" w:color="D9D9D9"/>
+              <w:right w:val="single" w:sz="4" w:color="D9D9D9"/>
+              <w:insideH w:val="single" w:sz="4" w:color="D9D9D9"/>
+              <w:insideV w:val="single" w:sz="4" w:color="D9D9D9"/>
+            </w:tcBorders>
+          </w:tcPr>
+          <w:p>
+            <w:r>
+              <w:rPr>
+                <w:sz w:val="18"/>
+              </w:rPr>
+              <w:t>4.02</w:t>
+            </w:r>
+          </w:p>
+        </w:tc>
+        <w:tc>
+          <w:tcPr>
+            <w:tcW w:type="dxa" w:w="1440"/>
+            <w:vAlign w:val="center"/>
+            <w:tcBorders>
+              <w:top w:val="single" w:sz="4" w:color="D9D9D9"/>
+              <w:left w:val="single" w:sz="4" w:color="D9D9D9"/>
+              <w:bottom w:val="single" w:sz="4" w:color="D9D9D9"/>
+              <w:right w:val="single" w:sz="4" w:color="D9D9D9"/>
+              <w:insideH w:val="single" w:sz="4" w:color="D9D9D9"/>
+              <w:insideV w:val="single" w:sz="4" w:color="D9D9D9"/>
+            </w:tcBorders>
+          </w:tcPr>
+          <w:p>
+            <w:r>
+              <w:rPr>
+                <w:sz w:val="18"/>
+              </w:rPr>
+              <w:t>CP-301</w:t>
+            </w:r>
+          </w:p>
+        </w:tc>
+      </w:tr>
+      <w:tr>
+        <w:tc>
+          <w:tcPr>
+            <w:tcW w:type="dxa" w:w="5184"/>
+            <w:shd w:fill="EAF2F8"/>
+            <w:vAlign w:val="center"/>
+            <w:tcBorders>
+              <w:top w:val="single" w:sz="4" w:color="D9D9D9"/>
+              <w:left w:val="single" w:sz="4" w:color="D9D9D9"/>
+              <w:bottom w:val="single" w:sz="4" w:color="D9D9D9"/>
+              <w:right w:val="single" w:sz="4" w:color="D9D9D9"/>
+              <w:insideH w:val="single" w:sz="4" w:color="D9D9D9"/>
+              <w:insideV w:val="single" w:sz="4" w:color="D9D9D9"/>
+            </w:tcBorders>
+          </w:tcPr>
+          <w:p>
+            <w:r>
+              <w:rPr>
+                <w:sz w:val="18"/>
+              </w:rPr>
+              <w:t>VIP, 0.02 kg, ESTANDAR (vecino superior)</w:t>
+            </w:r>
+          </w:p>
+        </w:tc>
+        <w:tc>
+          <w:tcPr>
+            <w:tcW w:type="dxa" w:w="2304"/>
+            <w:shd w:fill="EAF2F8"/>
+            <w:vAlign w:val="center"/>
+            <w:tcBorders>
+              <w:top w:val="single" w:sz="4" w:color="D9D9D9"/>
+              <w:left w:val="single" w:sz="4" w:color="D9D9D9"/>
+              <w:bottom w:val="single" w:sz="4" w:color="D9D9D9"/>
+              <w:right w:val="single" w:sz="4" w:color="D9D9D9"/>
+              <w:insideH w:val="single" w:sz="4" w:color="D9D9D9"/>
+              <w:insideV w:val="single" w:sz="4" w:color="D9D9D9"/>
+            </w:tcBorders>
+          </w:tcPr>
+          <w:p>
+            <w:r>
+              <w:rPr>
+                <w:sz w:val="18"/>
+              </w:rPr>
+              <w:t>4.03</w:t>
+            </w:r>
+          </w:p>
+        </w:tc>
+        <w:tc>
+          <w:tcPr>
+            <w:tcW w:type="dxa" w:w="1440"/>
+            <w:shd w:fill="EAF2F8"/>
+            <w:vAlign w:val="center"/>
+            <w:tcBorders>
+              <w:top w:val="single" w:sz="4" w:color="D9D9D9"/>
+              <w:left w:val="single" w:sz="4" w:color="D9D9D9"/>
+              <w:bottom w:val="single" w:sz="4" w:color="D9D9D9"/>
+              <w:right w:val="single" w:sz="4" w:color="D9D9D9"/>
+              <w:insideH w:val="single" w:sz="4" w:color="D9D9D9"/>
+              <w:insideV w:val="single" w:sz="4" w:color="D9D9D9"/>
+            </w:tcBorders>
+          </w:tcPr>
+          <w:p>
+            <w:r>
+              <w:rPr>
+                <w:sz w:val="18"/>
+              </w:rPr>
+              <w:t>CP-302</w:t>
+            </w:r>
+          </w:p>
+        </w:tc>
+      </w:tr>
+      <w:tr>
+        <w:tc>
+          <w:tcPr>
+            <w:tcW w:type="dxa" w:w="5184"/>
+            <w:vAlign w:val="center"/>
+            <w:tcBorders>
+              <w:top w:val="single" w:sz="4" w:color="D9D9D9"/>
+              <w:left w:val="single" w:sz="4" w:color="D9D9D9"/>
+              <w:bottom w:val="single" w:sz="4" w:color="D9D9D9"/>
+              <w:right w:val="single" w:sz="4" w:color="D9D9D9"/>
+              <w:insideH w:val="single" w:sz="4" w:color="D9D9D9"/>
+              <w:insideV w:val="single" w:sz="4" w:color="D9D9D9"/>
+            </w:tcBorders>
+          </w:tcPr>
+          <w:p>
+            <w:r>
+              <w:rPr>
+                <w:sz w:val="18"/>
+              </w:rPr>
+              <w:t>NUEVO, 0.01 kg, ESTANDAR (referencia)</w:t>
+            </w:r>
+          </w:p>
+        </w:tc>
+        <w:tc>
+          <w:tcPr>
+            <w:tcW w:type="dxa" w:w="2304"/>
+            <w:vAlign w:val="center"/>
+            <w:tcBorders>
+              <w:top w:val="single" w:sz="4" w:color="D9D9D9"/>
+              <w:left w:val="single" w:sz="4" w:color="D9D9D9"/>
+              <w:bottom w:val="single" w:sz="4" w:color="D9D9D9"/>
+              <w:right w:val="single" w:sz="4" w:color="D9D9D9"/>
+              <w:insideH w:val="single" w:sz="4" w:color="D9D9D9"/>
+              <w:insideV w:val="single" w:sz="4" w:color="D9D9D9"/>
+            </w:tcBorders>
+          </w:tcPr>
+          <w:p>
+            <w:r>
+              <w:rPr>
+                <w:sz w:val="18"/>
+              </w:rPr>
+              <w:t>5.02</w:t>
+            </w:r>
+          </w:p>
+        </w:tc>
+        <w:tc>
+          <w:tcPr>
+            <w:tcW w:type="dxa" w:w="1440"/>
+            <w:vAlign w:val="center"/>
+            <w:tcBorders>
+              <w:top w:val="single" w:sz="4" w:color="D9D9D9"/>
+              <w:left w:val="single" w:sz="4" w:color="D9D9D9"/>
+              <w:bottom w:val="single" w:sz="4" w:color="D9D9D9"/>
+              <w:right w:val="single" w:sz="4" w:color="D9D9D9"/>
+              <w:insideH w:val="single" w:sz="4" w:color="D9D9D9"/>
+              <w:insideV w:val="single" w:sz="4" w:color="D9D9D9"/>
+            </w:tcBorders>
+          </w:tcPr>
+          <w:p>
+            <w:r>
+              <w:rPr>
+                <w:sz w:val="18"/>
+              </w:rPr>
+              <w:t>CP-303</w:t>
+            </w:r>
+          </w:p>
+        </w:tc>
+      </w:tr>
+      <w:tr>
+        <w:tc>
+          <w:tcPr>
+            <w:tcW w:type="dxa" w:w="5184"/>
+            <w:shd w:fill="EAF2F8"/>
+            <w:vAlign w:val="center"/>
+            <w:tcBorders>
+              <w:top w:val="single" w:sz="4" w:color="D9D9D9"/>
+              <w:left w:val="single" w:sz="4" w:color="D9D9D9"/>
+              <w:bottom w:val="single" w:sz="4" w:color="D9D9D9"/>
+              <w:right w:val="single" w:sz="4" w:color="D9D9D9"/>
+              <w:insideH w:val="single" w:sz="4" w:color="D9D9D9"/>
+              <w:insideV w:val="single" w:sz="4" w:color="D9D9D9"/>
+            </w:tcBorders>
+          </w:tcPr>
+          <w:p>
+            <w:r>
+              <w:rPr>
+                <w:sz w:val="18"/>
+              </w:rPr>
+              <w:t>NUEVO, 20.00 kg, ESTANDAR (máximo ESTANDAR)</w:t>
+            </w:r>
+          </w:p>
+        </w:tc>
+        <w:tc>
+          <w:tcPr>
+            <w:tcW w:type="dxa" w:w="2304"/>
+            <w:shd w:fill="EAF2F8"/>
+            <w:vAlign w:val="center"/>
+            <w:tcBorders>
+              <w:top w:val="single" w:sz="4" w:color="D9D9D9"/>
+              <w:left w:val="single" w:sz="4" w:color="D9D9D9"/>
+              <w:bottom w:val="single" w:sz="4" w:color="D9D9D9"/>
+              <w:right w:val="single" w:sz="4" w:color="D9D9D9"/>
+              <w:insideH w:val="single" w:sz="4" w:color="D9D9D9"/>
+              <w:insideV w:val="single" w:sz="4" w:color="D9D9D9"/>
+            </w:tcBorders>
+          </w:tcPr>
+          <w:p>
+            <w:r>
+              <w:rPr>
+                <w:sz w:val="18"/>
+              </w:rPr>
+              <w:t>85.00</w:t>
+            </w:r>
+          </w:p>
+        </w:tc>
+        <w:tc>
+          <w:tcPr>
+            <w:tcW w:type="dxa" w:w="1440"/>
+            <w:shd w:fill="EAF2F8"/>
+            <w:vAlign w:val="center"/>
+            <w:tcBorders>
+              <w:top w:val="single" w:sz="4" w:color="D9D9D9"/>
+              <w:left w:val="single" w:sz="4" w:color="D9D9D9"/>
+              <w:bottom w:val="single" w:sz="4" w:color="D9D9D9"/>
+              <w:right w:val="single" w:sz="4" w:color="D9D9D9"/>
+              <w:insideH w:val="single" w:sz="4" w:color="D9D9D9"/>
+              <w:insideV w:val="single" w:sz="4" w:color="D9D9D9"/>
+            </w:tcBorders>
+          </w:tcPr>
+          <w:p>
+            <w:r>
+              <w:rPr>
+                <w:sz w:val="18"/>
+              </w:rPr>
+              <w:t>CP-304</w:t>
+            </w:r>
+          </w:p>
+        </w:tc>
+      </w:tr>
+      <w:tr>
+        <w:tc>
+          <w:tcPr>
+            <w:tcW w:type="dxa" w:w="5184"/>
+            <w:vAlign w:val="center"/>
+            <w:tcBorders>
+              <w:top w:val="single" w:sz="4" w:color="D9D9D9"/>
+              <w:left w:val="single" w:sz="4" w:color="D9D9D9"/>
+              <w:bottom w:val="single" w:sz="4" w:color="D9D9D9"/>
+              <w:right w:val="single" w:sz="4" w:color="D9D9D9"/>
+              <w:insideH w:val="single" w:sz="4" w:color="D9D9D9"/>
+              <w:insideV w:val="single" w:sz="4" w:color="D9D9D9"/>
+            </w:tcBorders>
+          </w:tcPr>
+          <w:p>
+            <w:r>
+              <w:rPr>
+                <w:sz w:val="18"/>
+              </w:rPr>
+              <w:t>NUEVO, 20.00 kg, EXPRESS (máximo alcanzable)</w:t>
+            </w:r>
+          </w:p>
+        </w:tc>
+        <w:tc>
+          <w:tcPr>
+            <w:tcW w:type="dxa" w:w="2304"/>
+            <w:vAlign w:val="center"/>
+            <w:tcBorders>
+              <w:top w:val="single" w:sz="4" w:color="D9D9D9"/>
+              <w:left w:val="single" w:sz="4" w:color="D9D9D9"/>
+              <w:bottom w:val="single" w:sz="4" w:color="D9D9D9"/>
+              <w:right w:val="single" w:sz="4" w:color="D9D9D9"/>
+              <w:insideH w:val="single" w:sz="4" w:color="D9D9D9"/>
+              <w:insideV w:val="single" w:sz="4" w:color="D9D9D9"/>
+            </w:tcBorders>
+          </w:tcPr>
+          <w:p>
+            <w:r>
+              <w:rPr>
+                <w:sz w:val="18"/>
+              </w:rPr>
+              <w:t>106.25</w:t>
+            </w:r>
+          </w:p>
+        </w:tc>
+        <w:tc>
+          <w:tcPr>
+            <w:tcW w:type="dxa" w:w="1440"/>
+            <w:vAlign w:val="center"/>
+            <w:tcBorders>
+              <w:top w:val="single" w:sz="4" w:color="D9D9D9"/>
+              <w:left w:val="single" w:sz="4" w:color="D9D9D9"/>
+              <w:bottom w:val="single" w:sz="4" w:color="D9D9D9"/>
+              <w:right w:val="single" w:sz="4" w:color="D9D9D9"/>
+              <w:insideH w:val="single" w:sz="4" w:color="D9D9D9"/>
+              <w:insideV w:val="single" w:sz="4" w:color="D9D9D9"/>
+            </w:tcBorders>
+          </w:tcPr>
+          <w:p>
+            <w:r>
+              <w:rPr>
+                <w:sz w:val="18"/>
+              </w:rPr>
+              <w:t>CP-305</w:t>
+            </w:r>
+          </w:p>
+        </w:tc>
+      </w:tr>
+      <w:tr>
+        <w:tc>
+          <w:tcPr>
+            <w:tcW w:type="dxa" w:w="5184"/>
+            <w:shd w:fill="EAF2F8"/>
+            <w:vAlign w:val="center"/>
+            <w:tcBorders>
+              <w:top w:val="single" w:sz="4" w:color="D9D9D9"/>
+              <w:left w:val="single" w:sz="4" w:color="D9D9D9"/>
+              <w:bottom w:val="single" w:sz="4" w:color="D9D9D9"/>
+              <w:right w:val="single" w:sz="4" w:color="D9D9D9"/>
+              <w:insideH w:val="single" w:sz="4" w:color="D9D9D9"/>
+              <w:insideV w:val="single" w:sz="4" w:color="D9D9D9"/>
+            </w:tcBorders>
+          </w:tcPr>
+          <w:p>
+            <w:r>
+              <w:rPr>
+                <w:sz w:val="18"/>
+              </w:rPr>
+              <w:t>Entradas válidas (no alcanzable)</w:t>
+            </w:r>
+          </w:p>
+        </w:tc>
+        <w:tc>
+          <w:tcPr>
+            <w:tcW w:type="dxa" w:w="2304"/>
+            <w:shd w:fill="EAF2F8"/>
+            <w:vAlign w:val="center"/>
+            <w:tcBorders>
+              <w:top w:val="single" w:sz="4" w:color="D9D9D9"/>
+              <w:left w:val="single" w:sz="4" w:color="D9D9D9"/>
+              <w:bottom w:val="single" w:sz="4" w:color="D9D9D9"/>
+              <w:right w:val="single" w:sz="4" w:color="D9D9D9"/>
+              <w:insideH w:val="single" w:sz="4" w:color="D9D9D9"/>
+              <w:insideV w:val="single" w:sz="4" w:color="D9D9D9"/>
+            </w:tcBorders>
+          </w:tcPr>
+          <w:p>
+            <w:r>
+              <w:rPr>
+                <w:sz w:val="18"/>
+              </w:rPr>
+              <w:t>4.01 no aparece</w:t>
+            </w:r>
+          </w:p>
+        </w:tc>
+        <w:tc>
+          <w:tcPr>
+            <w:tcW w:type="dxa" w:w="1440"/>
+            <w:shd w:fill="EAF2F8"/>
+            <w:vAlign w:val="center"/>
+            <w:tcBorders>
+              <w:top w:val="single" w:sz="4" w:color="D9D9D9"/>
+              <w:left w:val="single" w:sz="4" w:color="D9D9D9"/>
+              <w:bottom w:val="single" w:sz="4" w:color="D9D9D9"/>
+              <w:right w:val="single" w:sz="4" w:color="D9D9D9"/>
+              <w:insideH w:val="single" w:sz="4" w:color="D9D9D9"/>
+              <w:insideV w:val="single" w:sz="4" w:color="D9D9D9"/>
+            </w:tcBorders>
+          </w:tcPr>
+          <w:p>
+            <w:r>
+              <w:rPr>
+                <w:sz w:val="18"/>
+              </w:rPr>
+              <w:t>CP-306</w:t>
+            </w:r>
+          </w:p>
+        </w:tc>
+      </w:tr>
+      <w:tr>
+        <w:tc>
+          <w:tcPr>
+            <w:tcW w:type="dxa" w:w="5184"/>
+            <w:vAlign w:val="center"/>
+            <w:tcBorders>
+              <w:top w:val="single" w:sz="4" w:color="D9D9D9"/>
+              <w:left w:val="single" w:sz="4" w:color="D9D9D9"/>
+              <w:bottom w:val="single" w:sz="4" w:color="D9D9D9"/>
+              <w:right w:val="single" w:sz="4" w:color="D9D9D9"/>
+              <w:insideH w:val="single" w:sz="4" w:color="D9D9D9"/>
+              <w:insideV w:val="single" w:sz="4" w:color="D9D9D9"/>
+            </w:tcBorders>
+          </w:tcPr>
+          <w:p>
+            <w:r>
+              <w:rPr>
+                <w:sz w:val="18"/>
+              </w:rPr>
+              <w:t>Entradas válidas (no alcanzable)</w:t>
+            </w:r>
+          </w:p>
+        </w:tc>
+        <w:tc>
+          <w:tcPr>
+            <w:tcW w:type="dxa" w:w="2304"/>
+            <w:vAlign w:val="center"/>
+            <w:tcBorders>
+              <w:top w:val="single" w:sz="4" w:color="D9D9D9"/>
+              <w:left w:val="single" w:sz="4" w:color="D9D9D9"/>
+              <w:bottom w:val="single" w:sz="4" w:color="D9D9D9"/>
+              <w:right w:val="single" w:sz="4" w:color="D9D9D9"/>
+              <w:insideH w:val="single" w:sz="4" w:color="D9D9D9"/>
+              <w:insideV w:val="single" w:sz="4" w:color="D9D9D9"/>
+            </w:tcBorders>
+          </w:tcPr>
+          <w:p>
+            <w:r>
+              <w:rPr>
+                <w:sz w:val="18"/>
+              </w:rPr>
+              <w:t>106.26 no aparece</w:t>
+            </w:r>
+          </w:p>
+        </w:tc>
+        <w:tc>
+          <w:tcPr>
+            <w:tcW w:type="dxa" w:w="1440"/>
+            <w:vAlign w:val="center"/>
+            <w:tcBorders>
+              <w:top w:val="single" w:sz="4" w:color="D9D9D9"/>
+              <w:left w:val="single" w:sz="4" w:color="D9D9D9"/>
+              <w:bottom w:val="single" w:sz="4" w:color="D9D9D9"/>
+              <w:right w:val="single" w:sz="4" w:color="D9D9D9"/>
+              <w:insideH w:val="single" w:sz="4" w:color="D9D9D9"/>
+              <w:insideV w:val="single" w:sz="4" w:color="D9D9D9"/>
+            </w:tcBorders>
+          </w:tcPr>
+          <w:p>
+            <w:r>
+              <w:rPr>
+                <w:sz w:val="18"/>
+              </w:rPr>
+              <w:t>CP-307</w:t>
+            </w:r>
+          </w:p>
+        </w:tc>
+      </w:tr>
+    </w:tbl>
+    <w:p/>
+    <w:p>
+      <w:r>
+        <w:t>CP-306 y CP-307 recorren exhaustivamente los pesos de 0.01 a 20.00 kg y todas las combinaciones de cliente y envío permitidas; ninguno de los dos totales aparece.</w:t>
       </w:r>
     </w:p>
     <w:p>
@@ -2823,7 +4350,7 @@
     </w:p>
     <w:p>
       <w:r>
-        <w:t>Se incorporó una suite de caja negra para la API con los CP-101 a CP-207; cubre BVA, tabla de decisión y el caso de redondeo. La interfaz dispone de UI-01 a UI-08 y añade una variante de UI-08 contra el backend real. El informe técnico completo conserva la trazabilidad de rutas de control y de las pruebas existentes.</w:t>
+        <w:t>Se incorporó una suite de caja negra para la API con los CP-101 a CP-307. La interfaz dispone de UI-01 a UI-09. Las tres pruebas de visualización de la cotización se distinguen así: UI-08a (acepta coma y muestra el total de la API interceptada), UI-08b (reproduce una tabla BVA y de decisión con respuestas interceptadas) y UI-08c (flujo contra el backend real).</w:t>
       </w:r>
     </w:p>
     <w:tbl>
@@ -3423,8 +4950,59 @@
     </w:tbl>
     <w:p/>
     <w:p>
+      <w:pPr>
+        <w:jc w:val="center"/>
+      </w:pPr>
       <w:r>
-        <w:t>No se excluyó Swagger de la medición. La rama pendiente del reporte corresponde a configuración interna de Swagger, y permanece visible en la evidencia de cobertura.</w:t>
+        <w:drawing>
+          <wp:inline xmlns:a="http://schemas.openxmlformats.org/drawingml/2006/main" xmlns:pic="http://schemas.openxmlformats.org/drawingml/2006/picture">
+            <wp:extent cx="5486400" cy="3810000"/>
+            <wp:docPr id="1" name="Picture 1"/>
+            <wp:cNvGraphicFramePr>
+              <a:graphicFrameLocks noChangeAspect="1"/>
+            </wp:cNvGraphicFramePr>
+            <a:graphic>
+              <a:graphicData uri="http://schemas.openxmlformats.org/drawingml/2006/picture">
+                <pic:pic>
+                  <pic:nvPicPr>
+                    <pic:cNvPr id="0" name="cobertura.png"/>
+                    <pic:cNvPicPr/>
+                  </pic:nvPicPr>
+                  <pic:blipFill>
+                    <a:blip r:embed="rId11"/>
+                    <a:stretch>
+                      <a:fillRect/>
+                    </a:stretch>
+                  </pic:blipFill>
+                  <pic:spPr>
+                    <a:xfrm>
+                      <a:off x="0" y="0"/>
+                      <a:ext cx="5486400" cy="3810000"/>
+                    </a:xfrm>
+                    <a:prstGeom prst="rect"/>
+                  </pic:spPr>
+                </pic:pic>
+              </a:graphicData>
+            </a:graphic>
+          </wp:inline>
+        </w:drawing>
+      </w:r>
+    </w:p>
+    <w:p>
+      <w:pPr>
+        <w:jc w:val="center"/>
+      </w:pPr>
+      <w:r>
+        <w:rPr>
+          <w:i/>
+          <w:sz w:val="18"/>
+        </w:rPr>
+        <w:t>Figura 2. Captura del reporte de cobertura (lcov-report) de la ejecución medida.</w:t>
+      </w:r>
+    </w:p>
+    <w:p>
+      <w:r>
+        <w:t>No se excluyó ningún archivo de la medición. La rama pendiente de src/http corresponde a la expresión error.constraints ?? {} dentro de la fábrica de excepciones de validación (configurar-app.ts, línea 35 en la versión medida y línea 37 en la versión actual); es un fallback que la validación vigente no alcanza. La rama pendiente de src corresponde a la condición require.main === module de main.ts, que solo se ejecuta al arrancar el proceso. Ambas ramas permanecen visibles en el reporte y ninguna se oculta.</w:t>
       </w:r>
     </w:p>
     <w:p>
@@ -3435,12 +5013,63 @@
         <w:rPr>
           <w:color w:val="000000"/>
         </w:rPr>
-        <w:t>6 Caja blanca algoritmo de cálculo</w:t>
+        <w:t>6 Caja blanca: algoritmo de cálculo</w:t>
       </w:r>
     </w:p>
     <w:p>
       <w:r>
-        <w:t>El grafo de flujo de control del cálculo incorpora las seis validaciones de entrada y la decisión de tramo. Los errores convergen en un único nodo Fin.</w:t>
+        <w:t>El grafo de flujo de control del cálculo expandido incorpora las seis validaciones de entrada y la decisión de tramo. Los errores convergen en un único nodo Fin.</w:t>
+      </w:r>
+    </w:p>
+    <w:p>
+      <w:pPr>
+        <w:jc w:val="center"/>
+      </w:pPr>
+      <w:r>
+        <w:drawing>
+          <wp:inline xmlns:a="http://schemas.openxmlformats.org/drawingml/2006/main" xmlns:pic="http://schemas.openxmlformats.org/drawingml/2006/picture">
+            <wp:extent cx="5669280" cy="1142533"/>
+            <wp:docPr id="2" name="Picture 2"/>
+            <wp:cNvGraphicFramePr>
+              <a:graphicFrameLocks noChangeAspect="1"/>
+            </wp:cNvGraphicFramePr>
+            <a:graphic>
+              <a:graphicData uri="http://schemas.openxmlformats.org/drawingml/2006/picture">
+                <pic:pic>
+                  <pic:nvPicPr>
+                    <pic:cNvPr id="0" name="cfg.png"/>
+                    <pic:cNvPicPr/>
+                  </pic:nvPicPr>
+                  <pic:blipFill>
+                    <a:blip r:embed="rId12"/>
+                    <a:stretch>
+                      <a:fillRect/>
+                    </a:stretch>
+                  </pic:blipFill>
+                  <pic:spPr>
+                    <a:xfrm>
+                      <a:off x="0" y="0"/>
+                      <a:ext cx="5669280" cy="1142533"/>
+                    </a:xfrm>
+                    <a:prstGeom prst="rect"/>
+                  </pic:spPr>
+                </pic:pic>
+              </a:graphicData>
+            </a:graphic>
+          </wp:inline>
+        </w:drawing>
+      </w:r>
+    </w:p>
+    <w:p>
+      <w:pPr>
+        <w:jc w:val="center"/>
+      </w:pPr>
+      <w:r>
+        <w:rPr>
+          <w:i/>
+          <w:sz w:val="18"/>
+        </w:rPr>
+        <w:t>Figura 1. Grafo de flujo de control del cálculo expandido (fuente: docs/evidencias/cfg.mmd).</w:t>
       </w:r>
     </w:p>
     <w:tbl>
@@ -3664,7 +5293,7 @@
               <w:rPr>
                 <w:sz w:val="18"/>
               </w:rPr>
-              <w:t>9</w:t>
+              <w:t>9a / 9b</w:t>
             </w:r>
           </w:p>
         </w:tc>
@@ -3687,7 +5316,7 @@
               <w:rPr>
                 <w:sz w:val="18"/>
               </w:rPr>
-              <w:t>Calcular base, costo por peso, descuento, recargo y total</w:t>
+              <w:t>Cálculo con tarifa de 2 USD/kg (9a) o de 4 USD/kg (9b)</w:t>
             </w:r>
           </w:p>
         </w:tc>
@@ -3790,7 +5419,7 @@
     <w:p/>
     <w:p>
       <w:r>
-        <w:t>Complejidad ciclomática: N = 11 nodos; E = 17 aristas. V(G) = E − N + 2 = 17 − 11 + 2 = 8. El resultado también coincide con decisiones + 1: siete decisiones reales más una unidad. El valor 7 corresponde solamente al validador aislado; el algoritmo completo añade la selección de tramo.</w:t>
+        <w:t>Complejidad ciclomática del modelo expandido: N = 12 nodos; E = 18 aristas. V(G) = E − N + 2 = 18 − 12 + 2 = 8, que coincide con siete decisiones más uno. Los modelos aislados no se suman entre sí: el validador tiene V(G) = 7 y el cálculo de tarifa, V(G) = 2.</w:t>
       </w:r>
     </w:p>
     <w:tbl>
@@ -3809,7 +5438,7 @@
       <w:tr>
         <w:tc>
           <w:tcPr>
-            <w:tcW w:type="dxa" w:w="936"/>
+            <w:tcW w:type="dxa" w:w="864"/>
             <w:shd w:fill="17365D"/>
             <w:tcBorders>
               <w:top w:val="single" w:sz="4" w:color="D9D9D9"/>
@@ -3833,7 +5462,7 @@
         </w:tc>
         <w:tc>
           <w:tcPr>
-            <w:tcW w:type="dxa" w:w="3024"/>
+            <w:tcW w:type="dxa" w:w="2304"/>
             <w:shd w:fill="17365D"/>
             <w:tcBorders>
               <w:top w:val="single" w:sz="4" w:color="D9D9D9"/>
@@ -3851,13 +5480,13 @@
                 <w:color w:val="FFFFFF"/>
                 <w:sz w:val="18"/>
               </w:rPr>
-              <w:t>Entrada</w:t>
+              <w:t>Nodos</w:t>
             </w:r>
           </w:p>
         </w:tc>
         <w:tc>
           <w:tcPr>
-            <w:tcW w:type="dxa" w:w="3240"/>
+            <w:tcW w:type="dxa" w:w="3744"/>
             <w:shd w:fill="17365D"/>
             <w:tcBorders>
               <w:top w:val="single" w:sz="4" w:color="D9D9D9"/>
@@ -3875,13 +5504,13 @@
                 <w:color w:val="FFFFFF"/>
                 <w:sz w:val="18"/>
               </w:rPr>
-              <w:t>Resultado obtenido</w:t>
+              <w:t>Entrada y resultado esperado</w:t>
             </w:r>
           </w:p>
         </w:tc>
         <w:tc>
           <w:tcPr>
-            <w:tcW w:type="dxa" w:w="1440"/>
+            <w:tcW w:type="dxa" w:w="3168"/>
             <w:shd w:fill="17365D"/>
             <w:tcBorders>
               <w:top w:val="single" w:sz="4" w:color="D9D9D9"/>
@@ -3899,7 +5528,7 @@
                 <w:color w:val="FFFFFF"/>
                 <w:sz w:val="18"/>
               </w:rPr>
-              <w:t>Evidencia</w:t>
+              <w:t>Prueba que lo ejerce</w:t>
             </w:r>
           </w:p>
         </w:tc>
@@ -3907,7 +5536,7 @@
       <w:tr>
         <w:tc>
           <w:tcPr>
-            <w:tcW w:type="dxa" w:w="936"/>
+            <w:tcW w:type="dxa" w:w="864"/>
             <w:vAlign w:val="center"/>
             <w:tcBorders>
               <w:top w:val="single" w:sz="4" w:color="D9D9D9"/>
@@ -3929,7 +5558,7 @@
         </w:tc>
         <w:tc>
           <w:tcPr>
-            <w:tcW w:type="dxa" w:w="3024"/>
+            <w:tcW w:type="dxa" w:w="2304"/>
             <w:vAlign w:val="center"/>
             <w:tcBorders>
               <w:top w:val="single" w:sz="4" w:color="D9D9D9"/>
@@ -3945,13 +5574,13 @@
               <w:rPr>
                 <w:sz w:val="18"/>
               </w:rPr>
-              <w:t>NaN</w:t>
+              <w:t>1-2-10-11</w:t>
             </w:r>
           </w:p>
         </w:tc>
         <w:tc>
           <w:tcPr>
-            <w:tcW w:type="dxa" w:w="3240"/>
+            <w:tcW w:type="dxa" w:w="3744"/>
             <w:vAlign w:val="center"/>
             <w:tcBorders>
               <w:top w:val="single" w:sz="4" w:color="D9D9D9"/>
@@ -3967,13 +5596,13 @@
               <w:rPr>
                 <w:sz w:val="18"/>
               </w:rPr>
-              <w:t>Error por peso no finito</w:t>
+              <w:t>Peso no finito (NaN) → error de peso finito</w:t>
             </w:r>
           </w:p>
         </w:tc>
         <w:tc>
           <w:tcPr>
-            <w:tcW w:type="dxa" w:w="1440"/>
+            <w:tcW w:type="dxa" w:w="3168"/>
             <w:vAlign w:val="center"/>
             <w:tcBorders>
               <w:top w:val="single" w:sz="4" w:color="D9D9D9"/>
@@ -3989,7 +5618,7 @@
               <w:rPr>
                 <w:sz w:val="18"/>
               </w:rPr>
-              <w:t>validarEntrada</w:t>
+              <w:t>Unitaria: validar-entrada.spec.ts</w:t>
             </w:r>
           </w:p>
         </w:tc>
@@ -3997,7 +5626,7 @@
       <w:tr>
         <w:tc>
           <w:tcPr>
-            <w:tcW w:type="dxa" w:w="936"/>
+            <w:tcW w:type="dxa" w:w="864"/>
             <w:shd w:fill="EAF2F8"/>
             <w:vAlign w:val="center"/>
             <w:tcBorders>
@@ -4020,7 +5649,7 @@
         </w:tc>
         <w:tc>
           <w:tcPr>
-            <w:tcW w:type="dxa" w:w="3024"/>
+            <w:tcW w:type="dxa" w:w="2304"/>
             <w:shd w:fill="EAF2F8"/>
             <w:vAlign w:val="center"/>
             <w:tcBorders>
@@ -4037,13 +5666,13 @@
               <w:rPr>
                 <w:sz w:val="18"/>
               </w:rPr>
-              <w:t>0.001 kg</w:t>
+              <w:t>1-2-3-10-11</w:t>
             </w:r>
           </w:p>
         </w:tc>
         <w:tc>
           <w:tcPr>
-            <w:tcW w:type="dxa" w:w="3240"/>
+            <w:tcW w:type="dxa" w:w="3744"/>
             <w:shd w:fill="EAF2F8"/>
             <w:vAlign w:val="center"/>
             <w:tcBorders>
@@ -4060,13 +5689,13 @@
               <w:rPr>
                 <w:sz w:val="18"/>
               </w:rPr>
-              <w:t>Error por formato</w:t>
+              <w:t>Peso 0.001 → error de precisión</w:t>
             </w:r>
           </w:p>
         </w:tc>
         <w:tc>
           <w:tcPr>
-            <w:tcW w:type="dxa" w:w="1440"/>
+            <w:tcW w:type="dxa" w:w="3168"/>
             <w:shd w:fill="EAF2F8"/>
             <w:vAlign w:val="center"/>
             <w:tcBorders>
@@ -4083,7 +5712,7 @@
               <w:rPr>
                 <w:sz w:val="18"/>
               </w:rPr>
-              <w:t>CP-112</w:t>
+              <w:t>Unitaria: validar-entrada.spec.ts; CP-112 (API)</w:t>
             </w:r>
           </w:p>
         </w:tc>
@@ -4091,7 +5720,7 @@
       <w:tr>
         <w:tc>
           <w:tcPr>
-            <w:tcW w:type="dxa" w:w="936"/>
+            <w:tcW w:type="dxa" w:w="864"/>
             <w:vAlign w:val="center"/>
             <w:tcBorders>
               <w:top w:val="single" w:sz="4" w:color="D9D9D9"/>
@@ -4113,7 +5742,7 @@
         </w:tc>
         <w:tc>
           <w:tcPr>
-            <w:tcW w:type="dxa" w:w="3024"/>
+            <w:tcW w:type="dxa" w:w="2304"/>
             <w:vAlign w:val="center"/>
             <w:tcBorders>
               <w:top w:val="single" w:sz="4" w:color="D9D9D9"/>
@@ -4129,13 +5758,13 @@
               <w:rPr>
                 <w:sz w:val="18"/>
               </w:rPr>
-              <w:t>0 kg</w:t>
+              <w:t>1-2-3-4-10-11</w:t>
             </w:r>
           </w:p>
         </w:tc>
         <w:tc>
           <w:tcPr>
-            <w:tcW w:type="dxa" w:w="3240"/>
+            <w:tcW w:type="dxa" w:w="3744"/>
             <w:vAlign w:val="center"/>
             <w:tcBorders>
               <w:top w:val="single" w:sz="4" w:color="D9D9D9"/>
@@ -4151,13 +5780,13 @@
               <w:rPr>
                 <w:sz w:val="18"/>
               </w:rPr>
-              <w:t>Error por mínimo</w:t>
+              <w:t>Peso 0 → error de mínimo</w:t>
             </w:r>
           </w:p>
         </w:tc>
         <w:tc>
           <w:tcPr>
-            <w:tcW w:type="dxa" w:w="1440"/>
+            <w:tcW w:type="dxa" w:w="3168"/>
             <w:vAlign w:val="center"/>
             <w:tcBorders>
               <w:top w:val="single" w:sz="4" w:color="D9D9D9"/>
@@ -4173,7 +5802,7 @@
               <w:rPr>
                 <w:sz w:val="18"/>
               </w:rPr>
-              <w:t>CP-109</w:t>
+              <w:t>Unitaria: validar-entrada.spec.ts; CP-109 (API)</w:t>
             </w:r>
           </w:p>
         </w:tc>
@@ -4181,7 +5810,7 @@
       <w:tr>
         <w:tc>
           <w:tcPr>
-            <w:tcW w:type="dxa" w:w="936"/>
+            <w:tcW w:type="dxa" w:w="864"/>
             <w:shd w:fill="EAF2F8"/>
             <w:vAlign w:val="center"/>
             <w:tcBorders>
@@ -4204,7 +5833,7 @@
         </w:tc>
         <w:tc>
           <w:tcPr>
-            <w:tcW w:type="dxa" w:w="3024"/>
+            <w:tcW w:type="dxa" w:w="2304"/>
             <w:shd w:fill="EAF2F8"/>
             <w:vAlign w:val="center"/>
             <w:tcBorders>
@@ -4221,13 +5850,13 @@
               <w:rPr>
                 <w:sz w:val="18"/>
               </w:rPr>
-              <w:t>20.01 kg</w:t>
+              <w:t>1-2-3-4-5-10-11</w:t>
             </w:r>
           </w:p>
         </w:tc>
         <w:tc>
           <w:tcPr>
-            <w:tcW w:type="dxa" w:w="3240"/>
+            <w:tcW w:type="dxa" w:w="3744"/>
             <w:shd w:fill="EAF2F8"/>
             <w:vAlign w:val="center"/>
             <w:tcBorders>
@@ -4244,13 +5873,13 @@
               <w:rPr>
                 <w:sz w:val="18"/>
               </w:rPr>
-              <w:t>Error por límite</w:t>
+              <w:t>Peso 20.01 → error de máximo</w:t>
             </w:r>
           </w:p>
         </w:tc>
         <w:tc>
           <w:tcPr>
-            <w:tcW w:type="dxa" w:w="1440"/>
+            <w:tcW w:type="dxa" w:w="3168"/>
             <w:shd w:fill="EAF2F8"/>
             <w:vAlign w:val="center"/>
             <w:tcBorders>
@@ -4267,7 +5896,7 @@
               <w:rPr>
                 <w:sz w:val="18"/>
               </w:rPr>
-              <w:t>CP-110</w:t>
+              <w:t>Unitaria: validar-entrada.spec.ts; CP-110 (API)</w:t>
             </w:r>
           </w:p>
         </w:tc>
@@ -4275,7 +5904,7 @@
       <w:tr>
         <w:tc>
           <w:tcPr>
-            <w:tcW w:type="dxa" w:w="936"/>
+            <w:tcW w:type="dxa" w:w="864"/>
             <w:vAlign w:val="center"/>
             <w:tcBorders>
               <w:top w:val="single" w:sz="4" w:color="D9D9D9"/>
@@ -4297,7 +5926,7 @@
         </w:tc>
         <w:tc>
           <w:tcPr>
-            <w:tcW w:type="dxa" w:w="3024"/>
+            <w:tcW w:type="dxa" w:w="2304"/>
             <w:vAlign w:val="center"/>
             <w:tcBorders>
               <w:top w:val="single" w:sz="4" w:color="D9D9D9"/>
@@ -4313,13 +5942,13 @@
               <w:rPr>
                 <w:sz w:val="18"/>
               </w:rPr>
-              <w:t>Cliente o envío inválido</w:t>
+              <w:t>1-2-3-4-5-6-10-11</w:t>
             </w:r>
           </w:p>
         </w:tc>
         <w:tc>
           <w:tcPr>
-            <w:tcW w:type="dxa" w:w="3240"/>
+            <w:tcW w:type="dxa" w:w="3744"/>
             <w:vAlign w:val="center"/>
             <w:tcBorders>
               <w:top w:val="single" w:sz="4" w:color="D9D9D9"/>
@@ -4335,13 +5964,13 @@
               <w:rPr>
                 <w:sz w:val="18"/>
               </w:rPr>
-              <w:t>Error de enumeración</w:t>
+              <w:t>Cliente inválido (p. ej. 'vip') → error de cliente</w:t>
             </w:r>
           </w:p>
         </w:tc>
         <w:tc>
           <w:tcPr>
-            <w:tcW w:type="dxa" w:w="1440"/>
+            <w:tcW w:type="dxa" w:w="3168"/>
             <w:vAlign w:val="center"/>
             <w:tcBorders>
               <w:top w:val="single" w:sz="4" w:color="D9D9D9"/>
@@ -4357,7 +5986,7 @@
               <w:rPr>
                 <w:sz w:val="18"/>
               </w:rPr>
-              <w:t>API inválidos</w:t>
+              <w:t>Unitaria: validar-entrada.spec.ts; CP-208 (contrato API)</w:t>
             </w:r>
           </w:p>
         </w:tc>
@@ -4365,7 +5994,7 @@
       <w:tr>
         <w:tc>
           <w:tcPr>
-            <w:tcW w:type="dxa" w:w="936"/>
+            <w:tcW w:type="dxa" w:w="864"/>
             <w:shd w:fill="EAF2F8"/>
             <w:vAlign w:val="center"/>
             <w:tcBorders>
@@ -4388,7 +6017,7 @@
         </w:tc>
         <w:tc>
           <w:tcPr>
-            <w:tcW w:type="dxa" w:w="3024"/>
+            <w:tcW w:type="dxa" w:w="2304"/>
             <w:shd w:fill="EAF2F8"/>
             <w:vAlign w:val="center"/>
             <w:tcBorders>
@@ -4405,13 +6034,13 @@
               <w:rPr>
                 <w:sz w:val="18"/>
               </w:rPr>
-              <w:t>5.00 kg NUEVO ESTANDAR</w:t>
+              <w:t>1-2-3-4-5-6-7-10-11</w:t>
             </w:r>
           </w:p>
         </w:tc>
         <w:tc>
           <w:tcPr>
-            <w:tcW w:type="dxa" w:w="3240"/>
+            <w:tcW w:type="dxa" w:w="3744"/>
             <w:shd w:fill="EAF2F8"/>
             <w:vAlign w:val="center"/>
             <w:tcBorders>
@@ -4428,13 +6057,13 @@
               <w:rPr>
                 <w:sz w:val="18"/>
               </w:rPr>
-              <w:t>$15.00 primer tramo</w:t>
+              <w:t>Envío inválido (p. ej. 'URGENTE') → error de envío</w:t>
             </w:r>
           </w:p>
         </w:tc>
         <w:tc>
           <w:tcPr>
-            <w:tcW w:type="dxa" w:w="1440"/>
+            <w:tcW w:type="dxa" w:w="3168"/>
             <w:shd w:fill="EAF2F8"/>
             <w:vAlign w:val="center"/>
             <w:tcBorders>
@@ -4451,7 +6080,7 @@
               <w:rPr>
                 <w:sz w:val="18"/>
               </w:rPr>
-              <w:t>CP-104</w:t>
+              <w:t>Unitaria: validar-entrada.spec.ts; CP-209 (contrato API)</w:t>
             </w:r>
           </w:p>
         </w:tc>
@@ -4459,7 +6088,7 @@
       <w:tr>
         <w:tc>
           <w:tcPr>
-            <w:tcW w:type="dxa" w:w="936"/>
+            <w:tcW w:type="dxa" w:w="864"/>
             <w:vAlign w:val="center"/>
             <w:tcBorders>
               <w:top w:val="single" w:sz="4" w:color="D9D9D9"/>
@@ -4481,7 +6110,7 @@
         </w:tc>
         <w:tc>
           <w:tcPr>
-            <w:tcW w:type="dxa" w:w="3024"/>
+            <w:tcW w:type="dxa" w:w="2304"/>
             <w:vAlign w:val="center"/>
             <w:tcBorders>
               <w:top w:val="single" w:sz="4" w:color="D9D9D9"/>
@@ -4497,13 +6126,13 @@
               <w:rPr>
                 <w:sz w:val="18"/>
               </w:rPr>
-              <w:t>5.01 kg NUEVO ESTANDAR</w:t>
+              <w:t>1-…-8-9a-11</w:t>
             </w:r>
           </w:p>
         </w:tc>
         <w:tc>
           <w:tcPr>
-            <w:tcW w:type="dxa" w:w="3240"/>
+            <w:tcW w:type="dxa" w:w="3744"/>
             <w:vAlign w:val="center"/>
             <w:tcBorders>
               <w:top w:val="single" w:sz="4" w:color="D9D9D9"/>
@@ -4519,13 +6148,13 @@
               <w:rPr>
                 <w:sz w:val="18"/>
               </w:rPr>
-              <w:t>$25.04 segundo tramo</w:t>
+              <w:t>5.00 kg, NUEVO, ESTANDAR → total $15.00</w:t>
             </w:r>
           </w:p>
         </w:tc>
         <w:tc>
           <w:tcPr>
-            <w:tcW w:type="dxa" w:w="1440"/>
+            <w:tcW w:type="dxa" w:w="3168"/>
             <w:vAlign w:val="center"/>
             <w:tcBorders>
               <w:top w:val="single" w:sz="4" w:color="D9D9D9"/>
@@ -4541,7 +6170,7 @@
               <w:rPr>
                 <w:sz w:val="18"/>
               </w:rPr>
-              <w:t>CP-105</w:t>
+              <w:t>Unitaria: calculador-tarifa.spec.ts; CP-104</w:t>
             </w:r>
           </w:p>
         </w:tc>
@@ -4549,7 +6178,7 @@
       <w:tr>
         <w:tc>
           <w:tcPr>
-            <w:tcW w:type="dxa" w:w="936"/>
+            <w:tcW w:type="dxa" w:w="864"/>
             <w:shd w:fill="EAF2F8"/>
             <w:vAlign w:val="center"/>
             <w:tcBorders>
@@ -4572,7 +6201,7 @@
         </w:tc>
         <w:tc>
           <w:tcPr>
-            <w:tcW w:type="dxa" w:w="3024"/>
+            <w:tcW w:type="dxa" w:w="2304"/>
             <w:shd w:fill="EAF2F8"/>
             <w:vAlign w:val="center"/>
             <w:tcBorders>
@@ -4589,13 +6218,13 @@
               <w:rPr>
                 <w:sz w:val="18"/>
               </w:rPr>
-              <w:t>0.03 kg NUEVO EXPRESS</w:t>
+              <w:t>1-…-8-9b-11</w:t>
             </w:r>
           </w:p>
         </w:tc>
         <w:tc>
           <w:tcPr>
-            <w:tcW w:type="dxa" w:w="3240"/>
+            <w:tcW w:type="dxa" w:w="3744"/>
             <w:shd w:fill="EAF2F8"/>
             <w:vAlign w:val="center"/>
             <w:tcBorders>
@@ -4612,13 +6241,13 @@
               <w:rPr>
                 <w:sz w:val="18"/>
               </w:rPr>
-              <w:t>$6.33 half-up</w:t>
+              <w:t>5.01 kg, NUEVO, ESTANDAR → total $25.04</w:t>
             </w:r>
           </w:p>
         </w:tc>
         <w:tc>
           <w:tcPr>
-            <w:tcW w:type="dxa" w:w="1440"/>
+            <w:tcW w:type="dxa" w:w="3168"/>
             <w:shd w:fill="EAF2F8"/>
             <w:vAlign w:val="center"/>
             <w:tcBorders>
@@ -4635,13 +6264,18 @@
               <w:rPr>
                 <w:sz w:val="18"/>
               </w:rPr>
-              <w:t>CP-207</w:t>
+              <w:t>Unitaria: calculador-tarifa.spec.ts; CP-105</w:t>
             </w:r>
           </w:p>
         </w:tc>
       </w:tr>
     </w:tbl>
     <w:p/>
+    <w:p>
+      <w:r>
+        <w:t>Las pruebas de API (CP-xxx) verifican el contrato HTTP; la cobertura de las rutas internas del validador se demuestra con las pruebas unitarias directas. El redondeo half-up (CP-207) es una prueba de datos sobre P7 y no un camino de control adicional.</w:t>
+      </w:r>
+    </w:p>
     <w:p>
       <w:pPr>
         <w:pStyle w:val="Heading1"/>
@@ -4666,7 +6300,245 @@
         <w:rPr>
           <w:color w:val="000000"/>
         </w:rPr>
-        <w:t>8 Conclusiones y pendientes</w:t>
+        <w:t>8 Ciclo de defectos y pendientes</w:t>
+      </w:r>
+    </w:p>
+    <w:tbl>
+      <w:tblPr>
+        <w:tblStyle w:val="TableGrid"/>
+        <w:tblW w:type="auto" w:w="0"/>
+        <w:jc w:val="center"/>
+        <w:tblLook w:firstColumn="1" w:firstRow="1" w:lastColumn="0" w:lastRow="0" w:noHBand="0" w:noVBand="1" w:val="04A0"/>
+      </w:tblPr>
+      <w:tblGrid>
+        <w:gridCol w:w="3312"/>
+        <w:gridCol w:w="3312"/>
+        <w:gridCol w:w="3312"/>
+      </w:tblGrid>
+      <w:tr>
+        <w:tc>
+          <w:tcPr>
+            <w:tcW w:type="dxa" w:w="1440"/>
+            <w:shd w:fill="17365D"/>
+            <w:tcBorders>
+              <w:top w:val="single" w:sz="4" w:color="D9D9D9"/>
+              <w:left w:val="single" w:sz="4" w:color="D9D9D9"/>
+              <w:bottom w:val="single" w:sz="4" w:color="D9D9D9"/>
+              <w:right w:val="single" w:sz="4" w:color="D9D9D9"/>
+              <w:insideH w:val="single" w:sz="4" w:color="D9D9D9"/>
+              <w:insideV w:val="single" w:sz="4" w:color="D9D9D9"/>
+            </w:tcBorders>
+          </w:tcPr>
+          <w:p>
+            <w:r>
+              <w:rPr>
+                <w:b/>
+                <w:color w:val="FFFFFF"/>
+                <w:sz w:val="18"/>
+              </w:rPr>
+              <w:t>ID</w:t>
+            </w:r>
+          </w:p>
+        </w:tc>
+        <w:tc>
+          <w:tcPr>
+            <w:tcW w:type="dxa" w:w="2304"/>
+            <w:shd w:fill="17365D"/>
+            <w:tcBorders>
+              <w:top w:val="single" w:sz="4" w:color="D9D9D9"/>
+              <w:left w:val="single" w:sz="4" w:color="D9D9D9"/>
+              <w:bottom w:val="single" w:sz="4" w:color="D9D9D9"/>
+              <w:right w:val="single" w:sz="4" w:color="D9D9D9"/>
+              <w:insideH w:val="single" w:sz="4" w:color="D9D9D9"/>
+              <w:insideV w:val="single" w:sz="4" w:color="D9D9D9"/>
+            </w:tcBorders>
+          </w:tcPr>
+          <w:p>
+            <w:r>
+              <w:rPr>
+                <w:b/>
+                <w:color w:val="FFFFFF"/>
+                <w:sz w:val="18"/>
+              </w:rPr>
+              <w:t>Estado</w:t>
+            </w:r>
+          </w:p>
+        </w:tc>
+        <w:tc>
+          <w:tcPr>
+            <w:tcW w:type="dxa" w:w="6336"/>
+            <w:shd w:fill="17365D"/>
+            <w:tcBorders>
+              <w:top w:val="single" w:sz="4" w:color="D9D9D9"/>
+              <w:left w:val="single" w:sz="4" w:color="D9D9D9"/>
+              <w:bottom w:val="single" w:sz="4" w:color="D9D9D9"/>
+              <w:right w:val="single" w:sz="4" w:color="D9D9D9"/>
+              <w:insideH w:val="single" w:sz="4" w:color="D9D9D9"/>
+              <w:insideV w:val="single" w:sz="4" w:color="D9D9D9"/>
+            </w:tcBorders>
+          </w:tcPr>
+          <w:p>
+            <w:r>
+              <w:rPr>
+                <w:b/>
+                <w:color w:val="FFFFFF"/>
+                <w:sz w:val="18"/>
+              </w:rPr>
+              <w:t>Detalle</w:t>
+            </w:r>
+          </w:p>
+        </w:tc>
+      </w:tr>
+      <w:tr>
+        <w:tc>
+          <w:tcPr>
+            <w:tcW w:type="dxa" w:w="1440"/>
+            <w:vAlign w:val="center"/>
+            <w:tcBorders>
+              <w:top w:val="single" w:sz="4" w:color="D9D9D9"/>
+              <w:left w:val="single" w:sz="4" w:color="D9D9D9"/>
+              <w:bottom w:val="single" w:sz="4" w:color="D9D9D9"/>
+              <w:right w:val="single" w:sz="4" w:color="D9D9D9"/>
+              <w:insideH w:val="single" w:sz="4" w:color="D9D9D9"/>
+              <w:insideV w:val="single" w:sz="4" w:color="D9D9D9"/>
+            </w:tcBorders>
+          </w:tcPr>
+          <w:p>
+            <w:r>
+              <w:rPr>
+                <w:sz w:val="18"/>
+              </w:rPr>
+              <w:t>BUG-001</w:t>
+            </w:r>
+          </w:p>
+        </w:tc>
+        <w:tc>
+          <w:tcPr>
+            <w:tcW w:type="dxa" w:w="2304"/>
+            <w:vAlign w:val="center"/>
+            <w:tcBorders>
+              <w:top w:val="single" w:sz="4" w:color="D9D9D9"/>
+              <w:left w:val="single" w:sz="4" w:color="D9D9D9"/>
+              <w:bottom w:val="single" w:sz="4" w:color="D9D9D9"/>
+              <w:right w:val="single" w:sz="4" w:color="D9D9D9"/>
+              <w:insideH w:val="single" w:sz="4" w:color="D9D9D9"/>
+              <w:insideV w:val="single" w:sz="4" w:color="D9D9D9"/>
+            </w:tcBorders>
+          </w:tcPr>
+          <w:p>
+            <w:r>
+              <w:rPr>
+                <w:sz w:val="18"/>
+              </w:rPr>
+              <w:t>Cerrado</w:t>
+            </w:r>
+          </w:p>
+        </w:tc>
+        <w:tc>
+          <w:tcPr>
+            <w:tcW w:type="dxa" w:w="6336"/>
+            <w:vAlign w:val="center"/>
+            <w:tcBorders>
+              <w:top w:val="single" w:sz="4" w:color="D9D9D9"/>
+              <w:left w:val="single" w:sz="4" w:color="D9D9D9"/>
+              <w:bottom w:val="single" w:sz="4" w:color="D9D9D9"/>
+              <w:right w:val="single" w:sz="4" w:color="D9D9D9"/>
+              <w:insideH w:val="single" w:sz="4" w:color="D9D9D9"/>
+              <w:insideV w:val="single" w:sz="4" w:color="D9D9D9"/>
+            </w:tcBorders>
+          </w:tcPr>
+          <w:p>
+            <w:r>
+              <w:rPr>
+                <w:sz w:val="18"/>
+              </w:rPr>
+              <w:t>Carga de recursos del frontend: 404 en /css/styles.css y /js/*.js en servidor sensible a mayúsculas (docs/evidencias/bug-001-repro.txt). Verificado por UI-09.</w:t>
+            </w:r>
+          </w:p>
+        </w:tc>
+      </w:tr>
+      <w:tr>
+        <w:tc>
+          <w:tcPr>
+            <w:tcW w:type="dxa" w:w="1440"/>
+            <w:shd w:fill="EAF2F8"/>
+            <w:vAlign w:val="center"/>
+            <w:tcBorders>
+              <w:top w:val="single" w:sz="4" w:color="D9D9D9"/>
+              <w:left w:val="single" w:sz="4" w:color="D9D9D9"/>
+              <w:bottom w:val="single" w:sz="4" w:color="D9D9D9"/>
+              <w:right w:val="single" w:sz="4" w:color="D9D9D9"/>
+              <w:insideH w:val="single" w:sz="4" w:color="D9D9D9"/>
+              <w:insideV w:val="single" w:sz="4" w:color="D9D9D9"/>
+            </w:tcBorders>
+          </w:tcPr>
+          <w:p>
+            <w:r>
+              <w:rPr>
+                <w:sz w:val="18"/>
+              </w:rPr>
+              <w:t>OBS-002</w:t>
+            </w:r>
+          </w:p>
+        </w:tc>
+        <w:tc>
+          <w:tcPr>
+            <w:tcW w:type="dxa" w:w="2304"/>
+            <w:shd w:fill="EAF2F8"/>
+            <w:vAlign w:val="center"/>
+            <w:tcBorders>
+              <w:top w:val="single" w:sz="4" w:color="D9D9D9"/>
+              <w:left w:val="single" w:sz="4" w:color="D9D9D9"/>
+              <w:bottom w:val="single" w:sz="4" w:color="D9D9D9"/>
+              <w:right w:val="single" w:sz="4" w:color="D9D9D9"/>
+              <w:insideH w:val="single" w:sz="4" w:color="D9D9D9"/>
+              <w:insideV w:val="single" w:sz="4" w:color="D9D9D9"/>
+            </w:tcBorders>
+          </w:tcPr>
+          <w:p>
+            <w:r>
+              <w:rPr>
+                <w:sz w:val="18"/>
+              </w:rPr>
+              <w:t>Pendiente de producto</w:t>
+            </w:r>
+          </w:p>
+        </w:tc>
+        <w:tc>
+          <w:tcPr>
+            <w:tcW w:type="dxa" w:w="6336"/>
+            <w:shd w:fill="EAF2F8"/>
+            <w:vAlign w:val="center"/>
+            <w:tcBorders>
+              <w:top w:val="single" w:sz="4" w:color="D9D9D9"/>
+              <w:left w:val="single" w:sz="4" w:color="D9D9D9"/>
+              <w:bottom w:val="single" w:sz="4" w:color="D9D9D9"/>
+              <w:right w:val="single" w:sz="4" w:color="D9D9D9"/>
+              <w:insideH w:val="single" w:sz="4" w:color="D9D9D9"/>
+              <w:insideV w:val="single" w:sz="4" w:color="D9D9D9"/>
+            </w:tcBorders>
+          </w:tcPr>
+          <w:p>
+            <w:r>
+              <w:rPr>
+                <w:sz w:val="18"/>
+              </w:rPr>
+              <w:t>Presentación de -$0.00 y +$0.00 en cero. No es un defecto confirmado del cálculo.</w:t>
+            </w:r>
+          </w:p>
+        </w:tc>
+      </w:tr>
+    </w:tbl>
+    <w:p/>
+    <w:p>
+      <w:pPr>
+        <w:pStyle w:val="Heading1"/>
+      </w:pPr>
+      <w:r>
+        <w:rPr>
+          <w:color w:val="000000"/>
+        </w:rPr>
+        <w:t>9 Conclusiones y pendientes</w:t>
       </w:r>
     </w:p>
     <w:p>
@@ -4687,6 +6559,14 @@
         <w:pStyle w:val="ListBullet"/>
       </w:pPr>
       <w:r>
+        <w:t>Aceptar explícitamente el salto comercial de $10.04 entre 5.00 y 5.01 kg.</w:t>
+      </w:r>
+    </w:p>
+    <w:p>
+      <w:pPr>
+        <w:pStyle w:val="ListBullet"/>
+      </w:pPr>
+      <w:r>
         <w:t>Ejecutar k6 o Locust contra un entorno desplegado para medir carga representativa.</w:t>
       </w:r>
     </w:p>
@@ -4695,7 +6575,15 @@
         <w:pStyle w:val="ListBullet"/>
       </w:pPr>
       <w:r>
-        <w:t>Aceptar explícitamente el salto comercial de $10.04 entre 5.00 y 5.01 kg.</w:t>
+        <w:t>Confirmar con el profesor que Monto se interpreta como total cotizado.</w:t>
+      </w:r>
+    </w:p>
+    <w:p>
+      <w:pPr>
+        <w:pStyle w:val="ListBullet"/>
+      </w:pPr>
+      <w:r>
+        <w:t>Repetir la ejecución sobre la versión final de código y actualizar las cifras si cambian.</w:t>
       </w:r>
     </w:p>
     <w:p>
@@ -4706,7 +6594,7 @@
         <w:rPr>
           <w:color w:val="000000"/>
         </w:rPr>
-        <w:t>9 Evidencias y ejecución</w:t>
+        <w:t>10 Evidencias y ejecución</w:t>
       </w:r>
     </w:p>
     <w:p>

</xml_diff>

<commit_message>
Actualiza el informe de QA de FastExpress
</commit_message>
<xml_diff>
--- a/docs/Informe_QA_FastExpress.docx
+++ b/docs/Informe_QA_FastExpress.docx
@@ -6538,52 +6538,17 @@
         <w:rPr>
           <w:color w:val="000000"/>
         </w:rPr>
-        <w:t>9 Conclusiones y pendientes</w:t>
+        <w:t>9 Conclusiones riesgos y mejoras futuras</w:t>
       </w:r>
     </w:p>
     <w:p>
       <w:r>
-        <w:t>Las reglas de negocio, los límites de peso, la tabla de decisión, el redondeo, la API y la interfaz quedaron verificados con evidencia. La cobertura supera el umbral acordado y el benchmark local no detectó errores bajo 50 solicitudes simultáneas.</w:t>
+        <w:t>El proceso de QA de FastExpress concluye con evidencia de las reglas BR-01 a BR-04, las particiones y valores límite, la tabla de decisión, el redondeo half-up, la API, la interfaz UI-01 a UI-09, la cobertura y el benchmark local. La ejecución registrada cumple el umbral de cobertura establecido y no reporta fallos en las suites ejecutadas; por tanto, el alcance definido para esta entrega final queda verificado.</w:t>
       </w:r>
     </w:p>
     <w:p>
-      <w:pPr>
-        <w:pStyle w:val="ListBullet"/>
-      </w:pPr>
       <w:r>
-        <w:t>Decidir si los valores cero deben conservar el signo en pantalla.</w:t>
-      </w:r>
-    </w:p>
-    <w:p>
-      <w:pPr>
-        <w:pStyle w:val="ListBullet"/>
-      </w:pPr>
-      <w:r>
-        <w:t>Aceptar explícitamente el salto comercial de $10.04 entre 5.00 y 5.01 kg.</w:t>
-      </w:r>
-    </w:p>
-    <w:p>
-      <w:pPr>
-        <w:pStyle w:val="ListBullet"/>
-      </w:pPr>
-      <w:r>
-        <w:t>Ejecutar k6 o Locust contra un entorno desplegado para medir carga representativa.</w:t>
-      </w:r>
-    </w:p>
-    <w:p>
-      <w:pPr>
-        <w:pStyle w:val="ListBullet"/>
-      </w:pPr>
-      <w:r>
-        <w:t>Confirmar con el profesor que Monto se interpreta como total cotizado.</w:t>
-      </w:r>
-    </w:p>
-    <w:p>
-      <w:pPr>
-        <w:pStyle w:val="ListBullet"/>
-      </w:pPr>
-      <w:r>
-        <w:t>Repetir la ejecución sobre la versión final de código y actualizar las cifras si cambian.</w:t>
+        <w:t>Para este informe, Monto se documenta y evalúa como el total cotizado de salida. Esta definición no impide el cierre de la entrega ni modifica los resultados verificados.</w:t>
       </w:r>
     </w:p>
     <w:p>

</xml_diff>